<commit_message>
Histoire T8 : refonte style T5 — moteur + unité 1 (Histoire orale, 2 séances, docs : guides d'entretien, Callet)
Co-authored-by: arena-agent <297053741+arena-agent@users.noreply.github.com>
</commit_message>
<xml_diff>
--- a/manuel-histoire-t8/Manuel_Histoire_T8_UNITE1.docx
+++ b/manuel-histoire-t8/Manuel_Histoire_T8_UNITE1.docx
@@ -157,7 +157,7 @@
           <w:szCs w:val="24"/>
           <w:rFonts w:ascii="Times New Roman" w:cs="Times New Roman" w:eastAsia="Times New Roman" w:hAnsi="Times New Roman"/>
         </w:rPr>
-        <w:t xml:space="preserve">Ce manuel accompagne l’enseignant dans la mise en œuvre du programme officiel d’Histoire de la classe de T8 (huitième). Il couvre les sept thématiques du programme en sept unités : l’Histoire orale, les Temps modernes, l’époque contemporaine, les royaumes malgaches du XVᵉ au XIXᵉ siècle, le Royaume de Madagascar (1810-1896), Madagascar colonie française, et les patrimoines culturels et historiques de Madagascar, à raison de 2 heures par semaine. Conformément au programme, il développe la pensée historique et la démarche historique : exploiter des sources primaires, situer les faits dans le temps et dans l’espace, analyser les causes et les conséquences, et interpréter les réalités sociales pour comprendre le passé, expliquer le présent et améliorer le futur.</w:t>
+        <w:t xml:space="preserve">Ce manuel accompagne l’enseignant dans la mise en œuvre du programme officiel d’Histoire de la classe de T8 (quatrième). Il couvre les sept thématiques du programme en sept unités : l’Histoire orale, les Temps modernes, l’époque contemporaine, les royaumes malgaches du XVᵉ au XIXᵉ siècle, le Royaume de Madagascar (1810-1896), Madagascar colonie française, et les patrimoines culturels et historiques de Madagascar, à raison de 2 heures par semaine. Conformément au programme, il développe la pensée historique et la démarche historique : exploiter des sources primaires, situer les faits dans le temps et dans l’espace, analyser les causes et les conséquences, et interpréter les réalités sociales pour comprendre le passé, expliquer le présent et améliorer le futur.</w:t>
       </w:r>
     </w:p>
     <w:p>
@@ -176,7 +176,7 @@
           <w:szCs w:val="24"/>
           <w:rFonts w:ascii="Times New Roman" w:cs="Times New Roman" w:eastAsia="Times New Roman" w:hAnsi="Times New Roman"/>
         </w:rPr>
-        <w:t xml:space="preserve">Chaque séance associe une fiche de préparation directement exploitable, une leçon structurée avec définitions rigoureuses et reformulations simples, des frises chronologiques et des schémas exacts, des exercices et un corrigé détaillé. Les contenus mobilisent les repères de Madagascar et véhiculent les valeurs portées par le programme : curiosité et esprit critique, union nationale et patriotisme, savoir vivre ensemble, respect des biens communs et de l’environnement.</w:t>
+        <w:t xml:space="preserve">Chaque séance associe une fiche de préparation directement exploitable et une leçon conçue pour l’Histoire : un récit vivant qui raconte les faits dans l’ordre du temps, une étude de document pour exercer l’esprit critique, un encadré de repères (dates, personnages, vocabulaire), des frises chronologiques et des schémas exacts, des exercices et un corrigé détaillé. Les contenus mobilisent les repères de Madagascar et véhiculent les valeurs portées par le programme : curiosité et esprit critique, union nationale et patriotisme, savoir vivre ensemble, respect des biens communs et de l’environnement.</w:t>
       </w:r>
     </w:p>
     <w:p>
@@ -235,7 +235,7 @@
           <w:szCs w:val="24"/>
           <w:rFonts w:ascii="Times New Roman" w:cs="Times New Roman" w:eastAsia="Times New Roman" w:hAnsi="Times New Roman"/>
         </w:rPr>
-        <w:t xml:space="preserve">Code couleur : titre de leçon en rouge ; sous-titres en vert ; « Définition » en vert et « Autrement dit » en bleu ; « Erreur à éviter » en ocre ; corrigés en bordeaux ; encadré « Le savais-tu ? » sur fond bleu clair.</w:t>
+        <w:t xml:space="preserve">Organisation de la leçon : des parties numérotées aux titres tirés du programme (en vert), avec les mots-clés mis en évidence en bleu gras dans le texte ; un encadré « Document à étudier » (texte, questions et réponses) ; un encadré « Le savais-tu ? » sur fond bleu clair ; un « Petit lexique » en tableau ; puis les exercices et leurs corrigés en bordeaux.</w:t>
       </w:r>
     </w:p>
     <w:p>
@@ -2173,152 +2173,152 @@
                 <w:szCs w:val="20"/>
                 <w:rFonts w:ascii="Times New Roman" w:cs="Times New Roman" w:eastAsia="Times New Roman" w:hAnsi="Times New Roman"/>
               </w:rPr>
-              <w:t xml:space="preserve">3. Observation</w:t>
-            </w:r>
-          </w:p>
-        </w:tc>
-        <w:tc>
-          <w:tcPr>
-            <w:tcMar>
-              <w:top w:type="dxa" w:w="80"/>
-              <w:left w:type="dxa" w:w="80"/>
-              <w:bottom w:type="dxa" w:w="80"/>
-              <w:right w:type="dxa" w:w="80"/>
-            </w:tcMar>
-          </w:tcPr>
-          <w:p>
-            <w:pPr>
-              <w:spacing w:after="40"/>
-              <w:jc w:val="left"/>
-            </w:pPr>
-            <w:r>
-              <w:rPr>
-                <w:b w:val="false"/>
-                <w:bCs w:val="false"/>
-                <w:i w:val="false"/>
-                <w:iCs w:val="false"/>
-                <w:color w:val="000000"/>
-                <w:sz w:val="20"/>
-                <w:szCs w:val="20"/>
-                <w:rFonts w:ascii="Times New Roman" w:cs="Times New Roman" w:eastAsia="Times New Roman" w:hAnsi="Times New Roman"/>
-              </w:rPr>
-              <w:t xml:space="preserve">Enquête sur le marché communal : Vola pose les questions une à une en regardant la marchande ; Hery note ; Lova enregistre avec permission. Quand la marchande dérive vers la politique, Vola recadre : « Et les prix du riz à cette époque ? ».</w:t>
-            </w:r>
-          </w:p>
-        </w:tc>
-        <w:tc>
-          <w:tcPr>
-            <w:tcMar>
-              <w:top w:type="dxa" w:w="80"/>
-              <w:left w:type="dxa" w:w="80"/>
-              <w:bottom w:type="dxa" w:w="80"/>
-              <w:right w:type="dxa" w:w="80"/>
-            </w:tcMar>
-          </w:tcPr>
-          <w:p>
-            <w:pPr>
-              <w:spacing w:after="40"/>
-              <w:jc w:val="left"/>
-            </w:pPr>
-            <w:r>
-              <w:rPr>
-                <w:b w:val="false"/>
-                <w:bCs w:val="false"/>
-                <w:i w:val="false"/>
-                <w:iCs w:val="false"/>
-                <w:color w:val="000000"/>
-                <w:sz w:val="20"/>
-                <w:szCs w:val="20"/>
-                <w:rFonts w:ascii="Times New Roman" w:cs="Times New Roman" w:eastAsia="Times New Roman" w:hAnsi="Times New Roman"/>
-              </w:rPr>
-              <w:t xml:space="preserve">Observent l’exemple résolu.</w:t>
-            </w:r>
-          </w:p>
-        </w:tc>
-        <w:tc>
-          <w:tcPr>
-            <w:tcMar>
-              <w:top w:type="dxa" w:w="80"/>
-              <w:left w:type="dxa" w:w="80"/>
-              <w:bottom w:type="dxa" w:w="80"/>
-              <w:right w:type="dxa" w:w="80"/>
-            </w:tcMar>
-          </w:tcPr>
-          <w:p>
-            <w:pPr>
-              <w:spacing w:after="40"/>
-              <w:jc w:val="left"/>
-            </w:pPr>
-            <w:r>
-              <w:rPr>
-                <w:b w:val="false"/>
-                <w:bCs w:val="false"/>
-                <w:i w:val="false"/>
-                <w:iCs w:val="false"/>
-                <w:color w:val="000000"/>
-                <w:sz w:val="20"/>
-                <w:szCs w:val="20"/>
-                <w:rFonts w:ascii="Times New Roman" w:cs="Times New Roman" w:eastAsia="Times New Roman" w:hAnsi="Times New Roman"/>
-              </w:rPr>
-              <w:t xml:space="preserve">Observation dirigée</w:t>
-            </w:r>
-          </w:p>
-        </w:tc>
-        <w:tc>
-          <w:tcPr>
-            <w:tcMar>
-              <w:top w:type="dxa" w:w="80"/>
-              <w:left w:type="dxa" w:w="80"/>
-              <w:bottom w:type="dxa" w:w="80"/>
-              <w:right w:type="dxa" w:w="80"/>
-            </w:tcMar>
-          </w:tcPr>
-          <w:p>
-            <w:pPr>
-              <w:spacing w:after="40"/>
-              <w:jc w:val="left"/>
-            </w:pPr>
-            <w:r>
-              <w:rPr>
-                <w:b w:val="false"/>
-                <w:bCs w:val="false"/>
-                <w:i w:val="false"/>
-                <w:iCs w:val="false"/>
-                <w:color w:val="000000"/>
-                <w:sz w:val="20"/>
-                <w:szCs w:val="20"/>
-                <w:rFonts w:ascii="Times New Roman" w:cs="Times New Roman" w:eastAsia="Times New Roman" w:hAnsi="Times New Roman"/>
-              </w:rPr>
-              <w:t xml:space="preserve">Document imprimé</w:t>
-            </w:r>
-          </w:p>
-        </w:tc>
-        <w:tc>
-          <w:tcPr>
-            <w:tcMar>
-              <w:top w:type="dxa" w:w="80"/>
-              <w:left w:type="dxa" w:w="80"/>
-              <w:bottom w:type="dxa" w:w="80"/>
-              <w:right w:type="dxa" w:w="80"/>
-            </w:tcMar>
-          </w:tcPr>
-          <w:p>
-            <w:pPr>
-              <w:spacing w:after="40"/>
-              <w:jc w:val="left"/>
-            </w:pPr>
-            <w:r>
-              <w:rPr>
-                <w:b w:val="false"/>
-                <w:bCs w:val="false"/>
-                <w:i w:val="false"/>
-                <w:iCs w:val="false"/>
-                <w:color w:val="000000"/>
-                <w:sz w:val="20"/>
-                <w:szCs w:val="20"/>
-                <w:rFonts w:ascii="Times New Roman" w:cs="Times New Roman" w:eastAsia="Times New Roman" w:hAnsi="Times New Roman"/>
-              </w:rPr>
-              <w:t xml:space="preserve">Compréhension</w:t>
+              <w:t xml:space="preserve">3. Développement</w:t>
+            </w:r>
+          </w:p>
+        </w:tc>
+        <w:tc>
+          <w:tcPr>
+            <w:tcMar>
+              <w:top w:type="dxa" w:w="80"/>
+              <w:left w:type="dxa" w:w="80"/>
+              <w:bottom w:type="dxa" w:w="80"/>
+              <w:right w:type="dxa" w:w="80"/>
+            </w:tcMar>
+          </w:tcPr>
+          <w:p>
+            <w:pPr>
+              <w:spacing w:after="40"/>
+              <w:jc w:val="left"/>
+            </w:pPr>
+            <w:r>
+              <w:rPr>
+                <w:b w:val="false"/>
+                <w:bCs w:val="false"/>
+                <w:i w:val="false"/>
+                <w:iCs w:val="false"/>
+                <w:color w:val="000000"/>
+                <w:sz w:val="20"/>
+                <w:szCs w:val="20"/>
+                <w:rFonts w:ascii="Times New Roman" w:cs="Times New Roman" w:eastAsia="Times New Roman" w:hAnsi="Times New Roman"/>
+              </w:rPr>
+              <w:t xml:space="preserve">Développe la leçon partie par partie : Avant la rencontre : préparer et se concerter ; Pendant l’entretien : les cinq techniques ; Le respect malgache des aînés.</w:t>
+            </w:r>
+          </w:p>
+        </w:tc>
+        <w:tc>
+          <w:tcPr>
+            <w:tcMar>
+              <w:top w:type="dxa" w:w="80"/>
+              <w:left w:type="dxa" w:w="80"/>
+              <w:bottom w:type="dxa" w:w="80"/>
+              <w:right w:type="dxa" w:w="80"/>
+            </w:tcMar>
+          </w:tcPr>
+          <w:p>
+            <w:pPr>
+              <w:spacing w:after="40"/>
+              <w:jc w:val="left"/>
+            </w:pPr>
+            <w:r>
+              <w:rPr>
+                <w:b w:val="false"/>
+                <w:bCs w:val="false"/>
+                <w:i w:val="false"/>
+                <w:iCs w:val="false"/>
+                <w:color w:val="000000"/>
+                <w:sz w:val="20"/>
+                <w:szCs w:val="20"/>
+                <w:rFonts w:ascii="Times New Roman" w:cs="Times New Roman" w:eastAsia="Times New Roman" w:hAnsi="Times New Roman"/>
+              </w:rPr>
+              <w:t xml:space="preserve">Écoutent, répondent aux questions et notent les mots-clés.</w:t>
+            </w:r>
+          </w:p>
+        </w:tc>
+        <w:tc>
+          <w:tcPr>
+            <w:tcMar>
+              <w:top w:type="dxa" w:w="80"/>
+              <w:left w:type="dxa" w:w="80"/>
+              <w:bottom w:type="dxa" w:w="80"/>
+              <w:right w:type="dxa" w:w="80"/>
+            </w:tcMar>
+          </w:tcPr>
+          <w:p>
+            <w:pPr>
+              <w:spacing w:after="40"/>
+              <w:jc w:val="left"/>
+            </w:pPr>
+            <w:r>
+              <w:rPr>
+                <w:b w:val="false"/>
+                <w:bCs w:val="false"/>
+                <w:i w:val="false"/>
+                <w:iCs w:val="false"/>
+                <w:color w:val="000000"/>
+                <w:sz w:val="20"/>
+                <w:szCs w:val="20"/>
+                <w:rFonts w:ascii="Times New Roman" w:cs="Times New Roman" w:eastAsia="Times New Roman" w:hAnsi="Times New Roman"/>
+              </w:rPr>
+              <w:t xml:space="preserve">Exposé interactif, questions-réponses</w:t>
+            </w:r>
+          </w:p>
+        </w:tc>
+        <w:tc>
+          <w:tcPr>
+            <w:tcMar>
+              <w:top w:type="dxa" w:w="80"/>
+              <w:left w:type="dxa" w:w="80"/>
+              <w:bottom w:type="dxa" w:w="80"/>
+              <w:right w:type="dxa" w:w="80"/>
+            </w:tcMar>
+          </w:tcPr>
+          <w:p>
+            <w:pPr>
+              <w:spacing w:after="40"/>
+              <w:jc w:val="left"/>
+            </w:pPr>
+            <w:r>
+              <w:rPr>
+                <w:b w:val="false"/>
+                <w:bCs w:val="false"/>
+                <w:i w:val="false"/>
+                <w:iCs w:val="false"/>
+                <w:color w:val="000000"/>
+                <w:sz w:val="20"/>
+                <w:szCs w:val="20"/>
+                <w:rFonts w:ascii="Times New Roman" w:cs="Times New Roman" w:eastAsia="Times New Roman" w:hAnsi="Times New Roman"/>
+              </w:rPr>
+              <w:t xml:space="preserve">Tableau, frises, cartes</w:t>
+            </w:r>
+          </w:p>
+        </w:tc>
+        <w:tc>
+          <w:tcPr>
+            <w:tcMar>
+              <w:top w:type="dxa" w:w="80"/>
+              <w:left w:type="dxa" w:w="80"/>
+              <w:bottom w:type="dxa" w:w="80"/>
+              <w:right w:type="dxa" w:w="80"/>
+            </w:tcMar>
+          </w:tcPr>
+          <w:p>
+            <w:pPr>
+              <w:spacing w:after="40"/>
+              <w:jc w:val="left"/>
+            </w:pPr>
+            <w:r>
+              <w:rPr>
+                <w:b w:val="false"/>
+                <w:bCs w:val="false"/>
+                <w:i w:val="false"/>
+                <w:iCs w:val="false"/>
+                <w:color w:val="000000"/>
+                <w:sz w:val="20"/>
+                <w:szCs w:val="20"/>
+                <w:rFonts w:ascii="Times New Roman" w:cs="Times New Roman" w:eastAsia="Times New Roman" w:hAnsi="Times New Roman"/>
+              </w:rPr>
+              <w:t xml:space="preserve">Attention, participation</w:t>
             </w:r>
           </w:p>
         </w:tc>
@@ -2349,152 +2349,152 @@
                 <w:szCs w:val="20"/>
                 <w:rFonts w:ascii="Times New Roman" w:cs="Times New Roman" w:eastAsia="Times New Roman" w:hAnsi="Times New Roman"/>
               </w:rPr>
-              <w:t xml:space="preserve">4. Analyse</w:t>
-            </w:r>
-          </w:p>
-        </w:tc>
-        <w:tc>
-          <w:tcPr>
-            <w:tcMar>
-              <w:top w:type="dxa" w:w="80"/>
-              <w:left w:type="dxa" w:w="80"/>
-              <w:bottom w:type="dxa" w:w="80"/>
-              <w:right w:type="dxa" w:w="80"/>
-            </w:tcMar>
-          </w:tcPr>
-          <w:p>
-            <w:pPr>
-              <w:spacing w:after="40"/>
-              <w:jc w:val="left"/>
-            </w:pPr>
-            <w:r>
-              <w:rPr>
-                <w:b w:val="false"/>
-                <w:bCs w:val="false"/>
-                <w:i w:val="false"/>
-                <w:iCs w:val="false"/>
-                <w:color w:val="000000"/>
-                <w:sz w:val="20"/>
-                <w:szCs w:val="20"/>
-                <w:rFonts w:ascii="Times New Roman" w:cs="Times New Roman" w:eastAsia="Times New Roman" w:hAnsi="Times New Roman"/>
-              </w:rPr>
-              <w:t xml:space="preserve">Guide l’analyse : Tout commence avant la rencontre : le thème (par exemple « l’école de notre commune ») est précisé en un objet d’enquête (« l’école pendant les années 1970 »), puis en une question d’enquête claire. Le groupe se concerte : qui pose les questions ? qui note ? qui enregistre ? qui surveille le temps ? Un entretien où tout le monde parle est un entretien perdu. Pendant la rencontre, le contact visuel montre au témoin qu’on l’écoute : les yeux dans le cahier, l’attention tombe, et le témoin aussi se décourage. L’empathie consiste à se mettre à la place du témoin : certains souvenirs sont douloureux ou intimes, on ne force jamais, on respecte les silences. On pose une seule question à la fois : deux questions ensemble, et le témoin n’en retient qu’une. Puis on laisse raconter librement : les détours d’un récit contiennent souvent des informations précieuses que le questionnaire n’avait pas prévues. Enfin, si le témoin s’éloigne trop longtemps du sujet, on recadre avec politesse : « C’est très intéressant — et à l’école, comment cela se passait-il ? ». À Madagascar, le respect dû aux aînés ajoute ses règles : saluer selon l’usage, se présenter, remercier, et demander la permission avant d’enregistrer.</w:t>
-            </w:r>
-          </w:p>
-        </w:tc>
-        <w:tc>
-          <w:tcPr>
-            <w:tcMar>
-              <w:top w:type="dxa" w:w="80"/>
-              <w:left w:type="dxa" w:w="80"/>
-              <w:bottom w:type="dxa" w:w="80"/>
-              <w:right w:type="dxa" w:w="80"/>
-            </w:tcMar>
-          </w:tcPr>
-          <w:p>
-            <w:pPr>
-              <w:spacing w:after="40"/>
-              <w:jc w:val="left"/>
-            </w:pPr>
-            <w:r>
-              <w:rPr>
-                <w:b w:val="false"/>
-                <w:bCs w:val="false"/>
-                <w:i w:val="false"/>
-                <w:iCs w:val="false"/>
-                <w:color w:val="000000"/>
-                <w:sz w:val="20"/>
-                <w:szCs w:val="20"/>
-                <w:rFonts w:ascii="Times New Roman" w:cs="Times New Roman" w:eastAsia="Times New Roman" w:hAnsi="Times New Roman"/>
-              </w:rPr>
-              <w:t xml:space="preserve">Expliquent la démarche et vérifient le résultat.</w:t>
-            </w:r>
-          </w:p>
-        </w:tc>
-        <w:tc>
-          <w:tcPr>
-            <w:tcMar>
-              <w:top w:type="dxa" w:w="80"/>
-              <w:left w:type="dxa" w:w="80"/>
-              <w:bottom w:type="dxa" w:w="80"/>
-              <w:right w:type="dxa" w:w="80"/>
-            </w:tcMar>
-          </w:tcPr>
-          <w:p>
-            <w:pPr>
-              <w:spacing w:after="40"/>
-              <w:jc w:val="left"/>
-            </w:pPr>
-            <w:r>
-              <w:rPr>
-                <w:b w:val="false"/>
-                <w:bCs w:val="false"/>
-                <w:i w:val="false"/>
-                <w:iCs w:val="false"/>
-                <w:color w:val="000000"/>
-                <w:sz w:val="20"/>
-                <w:szCs w:val="20"/>
-                <w:rFonts w:ascii="Times New Roman" w:cs="Times New Roman" w:eastAsia="Times New Roman" w:hAnsi="Times New Roman"/>
-              </w:rPr>
-              <w:t xml:space="preserve">Recherche en binômes</w:t>
-            </w:r>
-          </w:p>
-        </w:tc>
-        <w:tc>
-          <w:tcPr>
-            <w:tcMar>
-              <w:top w:type="dxa" w:w="80"/>
-              <w:left w:type="dxa" w:w="80"/>
-              <w:bottom w:type="dxa" w:w="80"/>
-              <w:right w:type="dxa" w:w="80"/>
-            </w:tcMar>
-          </w:tcPr>
-          <w:p>
-            <w:pPr>
-              <w:spacing w:after="40"/>
-              <w:jc w:val="left"/>
-            </w:pPr>
-            <w:r>
-              <w:rPr>
-                <w:b w:val="false"/>
-                <w:bCs w:val="false"/>
-                <w:i w:val="false"/>
-                <w:iCs w:val="false"/>
-                <w:color w:val="000000"/>
-                <w:sz w:val="20"/>
-                <w:szCs w:val="20"/>
-                <w:rFonts w:ascii="Times New Roman" w:cs="Times New Roman" w:eastAsia="Times New Roman" w:hAnsi="Times New Roman"/>
-              </w:rPr>
-              <w:t xml:space="preserve">Documents, cartes, frises</w:t>
-            </w:r>
-          </w:p>
-        </w:tc>
-        <w:tc>
-          <w:tcPr>
-            <w:tcMar>
-              <w:top w:type="dxa" w:w="80"/>
-              <w:left w:type="dxa" w:w="80"/>
-              <w:bottom w:type="dxa" w:w="80"/>
-              <w:right w:type="dxa" w:w="80"/>
-            </w:tcMar>
-          </w:tcPr>
-          <w:p>
-            <w:pPr>
-              <w:spacing w:after="40"/>
-              <w:jc w:val="left"/>
-            </w:pPr>
-            <w:r>
-              <w:rPr>
-                <w:b w:val="false"/>
-                <w:bCs w:val="false"/>
-                <w:i w:val="false"/>
-                <w:iCs w:val="false"/>
-                <w:color w:val="000000"/>
-                <w:sz w:val="20"/>
-                <w:szCs w:val="20"/>
-                <w:rFonts w:ascii="Times New Roman" w:cs="Times New Roman" w:eastAsia="Times New Roman" w:hAnsi="Times New Roman"/>
-              </w:rPr>
-              <w:t xml:space="preserve">Raisonnement</w:t>
+              <w:t xml:space="preserve">4. Étude de document</w:t>
+            </w:r>
+          </w:p>
+        </w:tc>
+        <w:tc>
+          <w:tcPr>
+            <w:tcMar>
+              <w:top w:type="dxa" w:w="80"/>
+              <w:left w:type="dxa" w:w="80"/>
+              <w:bottom w:type="dxa" w:w="80"/>
+              <w:right w:type="dxa" w:w="80"/>
+            </w:tcMar>
+          </w:tcPr>
+          <w:p>
+            <w:pPr>
+              <w:spacing w:after="40"/>
+              <w:jc w:val="left"/>
+            </w:pPr>
+            <w:r>
+              <w:rPr>
+                <w:b w:val="false"/>
+                <w:bCs w:val="false"/>
+                <w:i w:val="false"/>
+                <w:iCs w:val="false"/>
+                <w:color w:val="000000"/>
+                <w:sz w:val="20"/>
+                <w:szCs w:val="20"/>
+                <w:rFonts w:ascii="Times New Roman" w:cs="Times New Roman" w:eastAsia="Times New Roman" w:hAnsi="Times New Roman"/>
+              </w:rPr>
+              <w:t xml:space="preserve">Fait lire le document « Les conseils du collecteur de mémoire » (d’après les guides d’entretien des grandes archives d’Histoire orale — texte reconstitué), puis pose les questions.</w:t>
+            </w:r>
+          </w:p>
+        </w:tc>
+        <w:tc>
+          <w:tcPr>
+            <w:tcMar>
+              <w:top w:type="dxa" w:w="80"/>
+              <w:left w:type="dxa" w:w="80"/>
+              <w:bottom w:type="dxa" w:w="80"/>
+              <w:right w:type="dxa" w:w="80"/>
+            </w:tcMar>
+          </w:tcPr>
+          <w:p>
+            <w:pPr>
+              <w:spacing w:after="40"/>
+              <w:jc w:val="left"/>
+            </w:pPr>
+            <w:r>
+              <w:rPr>
+                <w:b w:val="false"/>
+                <w:bCs w:val="false"/>
+                <w:i w:val="false"/>
+                <w:iCs w:val="false"/>
+                <w:color w:val="000000"/>
+                <w:sz w:val="20"/>
+                <w:szCs w:val="20"/>
+                <w:rFonts w:ascii="Times New Roman" w:cs="Times New Roman" w:eastAsia="Times New Roman" w:hAnsi="Times New Roman"/>
+              </w:rPr>
+              <w:t xml:space="preserve">Lisent le document, répondent aux questions et critiquent la source.</w:t>
+            </w:r>
+          </w:p>
+        </w:tc>
+        <w:tc>
+          <w:tcPr>
+            <w:tcMar>
+              <w:top w:type="dxa" w:w="80"/>
+              <w:left w:type="dxa" w:w="80"/>
+              <w:bottom w:type="dxa" w:w="80"/>
+              <w:right w:type="dxa" w:w="80"/>
+            </w:tcMar>
+          </w:tcPr>
+          <w:p>
+            <w:pPr>
+              <w:spacing w:after="40"/>
+              <w:jc w:val="left"/>
+            </w:pPr>
+            <w:r>
+              <w:rPr>
+                <w:b w:val="false"/>
+                <w:bCs w:val="false"/>
+                <w:i w:val="false"/>
+                <w:iCs w:val="false"/>
+                <w:color w:val="000000"/>
+                <w:sz w:val="20"/>
+                <w:szCs w:val="20"/>
+                <w:rFonts w:ascii="Times New Roman" w:cs="Times New Roman" w:eastAsia="Times New Roman" w:hAnsi="Times New Roman"/>
+              </w:rPr>
+              <w:t xml:space="preserve">Observation dirigée, travail en binômes</w:t>
+            </w:r>
+          </w:p>
+        </w:tc>
+        <w:tc>
+          <w:tcPr>
+            <w:tcMar>
+              <w:top w:type="dxa" w:w="80"/>
+              <w:left w:type="dxa" w:w="80"/>
+              <w:bottom w:type="dxa" w:w="80"/>
+              <w:right w:type="dxa" w:w="80"/>
+            </w:tcMar>
+          </w:tcPr>
+          <w:p>
+            <w:pPr>
+              <w:spacing w:after="40"/>
+              <w:jc w:val="left"/>
+            </w:pPr>
+            <w:r>
+              <w:rPr>
+                <w:b w:val="false"/>
+                <w:bCs w:val="false"/>
+                <w:i w:val="false"/>
+                <w:iCs w:val="false"/>
+                <w:color w:val="000000"/>
+                <w:sz w:val="20"/>
+                <w:szCs w:val="20"/>
+                <w:rFonts w:ascii="Times New Roman" w:cs="Times New Roman" w:eastAsia="Times New Roman" w:hAnsi="Times New Roman"/>
+              </w:rPr>
+              <w:t xml:space="preserve">Document imprimé</w:t>
+            </w:r>
+          </w:p>
+        </w:tc>
+        <w:tc>
+          <w:tcPr>
+            <w:tcMar>
+              <w:top w:type="dxa" w:w="80"/>
+              <w:left w:type="dxa" w:w="80"/>
+              <w:bottom w:type="dxa" w:w="80"/>
+              <w:right w:type="dxa" w:w="80"/>
+            </w:tcMar>
+          </w:tcPr>
+          <w:p>
+            <w:pPr>
+              <w:spacing w:after="40"/>
+              <w:jc w:val="left"/>
+            </w:pPr>
+            <w:r>
+              <w:rPr>
+                <w:b w:val="false"/>
+                <w:bCs w:val="false"/>
+                <w:i w:val="false"/>
+                <w:iCs w:val="false"/>
+                <w:color w:val="000000"/>
+                <w:sz w:val="20"/>
+                <w:szCs w:val="20"/>
+                <w:rFonts w:ascii="Times New Roman" w:cs="Times New Roman" w:eastAsia="Times New Roman" w:hAnsi="Times New Roman"/>
+              </w:rPr>
+              <w:t xml:space="preserve">Esprit critique</w:t>
             </w:r>
           </w:p>
         </w:tc>
@@ -3100,7 +3100,26 @@
     </w:p>
     <w:p>
       <w:pPr>
-        <w:spacing w:after="110" w:line="300"/>
+        <w:spacing w:after="160" w:line="300"/>
+        <w:jc w:val="center"/>
+      </w:pPr>
+      <w:r>
+        <w:rPr>
+          <w:b w:val="false"/>
+          <w:bCs w:val="false"/>
+          <w:i/>
+          <w:iCs/>
+          <w:color w:val="000000"/>
+          <w:sz w:val="21"/>
+          <w:szCs w:val="21"/>
+          <w:rFonts w:ascii="Times New Roman" w:cs="Times New Roman" w:eastAsia="Times New Roman" w:hAnsi="Times New Roman"/>
+        </w:rPr>
+        <w:t xml:space="preserve">Tous parlent en même temps, les yeux dans les cahiers… et Dadabe se tait : un entretien ne s’improvise pas.</w:t>
+      </w:r>
+    </w:p>
+    <w:p>
+      <w:pPr>
+        <w:spacing w:after="80" w:line="300"/>
         <w:jc w:val="both"/>
       </w:pPr>
       <w:r>
@@ -3110,11 +3129,30 @@
           <w:i w:val="false"/>
           <w:iCs w:val="false"/>
           <w:color w:val="2E7D32"/>
-          <w:sz w:val="24"/>
-          <w:szCs w:val="24"/>
-          <w:rFonts w:ascii="Times New Roman" w:cs="Times New Roman" w:eastAsia="Times New Roman" w:hAnsi="Times New Roman"/>
-        </w:rPr>
-        <w:t xml:space="preserve">Définition — </w:t>
+          <w:sz w:val="26"/>
+          <w:szCs w:val="26"/>
+          <w:rFonts w:ascii="Times New Roman" w:cs="Times New Roman" w:eastAsia="Times New Roman" w:hAnsi="Times New Roman"/>
+        </w:rPr>
+        <w:t xml:space="preserve">1. Avant la rencontre : préparer et se concerter</w:t>
+      </w:r>
+    </w:p>
+    <w:p>
+      <w:pPr>
+        <w:spacing w:after="100" w:line="300"/>
+        <w:jc w:val="both"/>
+      </w:pPr>
+      <w:r>
+        <w:rPr>
+          <w:b w:val="false"/>
+          <w:bCs w:val="false"/>
+          <w:i w:val="false"/>
+          <w:iCs w:val="false"/>
+          <w:color w:val="000000"/>
+          <w:sz w:val="24"/>
+          <w:szCs w:val="24"/>
+          <w:rFonts w:ascii="Times New Roman" w:cs="Times New Roman" w:eastAsia="Times New Roman" w:hAnsi="Times New Roman"/>
+        </w:rPr>
+        <w:t xml:space="preserve">L’</w:t>
       </w:r>
       <w:r>
         <w:rPr>
@@ -3122,19 +3160,26 @@
           <w:bCs/>
           <w:i w:val="false"/>
           <w:iCs w:val="false"/>
+          <w:color w:val="1F4E79"/>
+          <w:sz w:val="24"/>
+          <w:szCs w:val="24"/>
+          <w:rFonts w:ascii="Times New Roman" w:cs="Times New Roman" w:eastAsia="Times New Roman" w:hAnsi="Times New Roman"/>
+        </w:rPr>
+        <w:t xml:space="preserve">enquête orale</w:t>
+      </w:r>
+      <w:r>
+        <w:rPr>
+          <w:b w:val="false"/>
+          <w:bCs w:val="false"/>
+          <w:i w:val="false"/>
+          <w:iCs w:val="false"/>
           <w:color w:val="000000"/>
           <w:sz w:val="24"/>
           <w:szCs w:val="24"/>
           <w:rFonts w:ascii="Times New Roman" w:cs="Times New Roman" w:eastAsia="Times New Roman" w:hAnsi="Times New Roman"/>
         </w:rPr>
-        <w:t xml:space="preserve">L’enquête orale est la collecte d’informations historiques auprès de témoins, par l’entretien. Elle se prépare : on choisit le thème et l’objet de l’enquête, on formule la question, et le groupe se concerte pour répartir les rôles. Pendant l’entretien, l’enquêteur garde le contact visuel, fait preuve d’empathie, pose une seule question à la fois, laisse le témoin raconter librement et le recadre poliment s’il s’éloigne du sujet.</w:t>
-      </w:r>
-    </w:p>
-    <w:p>
-      <w:pPr>
-        <w:spacing w:after="110" w:line="300"/>
-        <w:jc w:val="both"/>
-      </w:pPr>
+        <w:t xml:space="preserve"> est la collecte d’informations historiques auprès de témoins, par l’entretien. Tout commence avant la rencontre : le </w:t>
+      </w:r>
       <w:r>
         <w:rPr>
           <w:b/>
@@ -3146,7 +3191,7 @@
           <w:szCs w:val="24"/>
           <w:rFonts w:ascii="Times New Roman" w:cs="Times New Roman" w:eastAsia="Times New Roman" w:hAnsi="Times New Roman"/>
         </w:rPr>
-        <w:t xml:space="preserve">Autrement dit : </w:t>
+        <w:t xml:space="preserve">thème</w:t>
       </w:r>
       <w:r>
         <w:rPr>
@@ -3159,14 +3204,21 @@
           <w:szCs w:val="24"/>
           <w:rFonts w:ascii="Times New Roman" w:cs="Times New Roman" w:eastAsia="Times New Roman" w:hAnsi="Times New Roman"/>
         </w:rPr>
-        <w:t xml:space="preserve">pour qu’un ancien raconte vraiment, il faut le regarder, le comprendre, lui poser une question simple à la fois, le laisser parler — et le ramener doucement au sujet s’il s’égare.</w:t>
-      </w:r>
-    </w:p>
-    <w:p>
-      <w:pPr>
-        <w:spacing w:after="110" w:line="300"/>
-        <w:jc w:val="both"/>
-      </w:pPr>
+        <w:t xml:space="preserve"> (par exemple « l’école de notre commune ») est précisé en un </w:t>
+      </w:r>
+      <w:r>
+        <w:rPr>
+          <w:b/>
+          <w:bCs/>
+          <w:i w:val="false"/>
+          <w:iCs w:val="false"/>
+          <w:color w:val="1F4E79"/>
+          <w:sz w:val="24"/>
+          <w:szCs w:val="24"/>
+          <w:rFonts w:ascii="Times New Roman" w:cs="Times New Roman" w:eastAsia="Times New Roman" w:hAnsi="Times New Roman"/>
+        </w:rPr>
+        <w:t xml:space="preserve">objet d’enquête</w:t>
+      </w:r>
       <w:r>
         <w:rPr>
           <w:b w:val="false"/>
@@ -3178,7 +3230,353 @@
           <w:szCs w:val="24"/>
           <w:rFonts w:ascii="Times New Roman" w:cs="Times New Roman" w:eastAsia="Times New Roman" w:hAnsi="Times New Roman"/>
         </w:rPr>
-        <w:t xml:space="preserve">Tout commence avant la rencontre : le thème (par exemple « l’école de notre commune ») est précisé en un objet d’enquête (« l’école pendant les années 1970 »), puis en une question d’enquête claire. Le groupe se concerte : qui pose les questions ? qui note ? qui enregistre ? qui surveille le temps ? Un entretien où tout le monde parle est un entretien perdu. Pendant la rencontre, le contact visuel montre au témoin qu’on l’écoute : les yeux dans le cahier, l’attention tombe, et le témoin aussi se décourage. L’empathie consiste à se mettre à la place du témoin : certains souvenirs sont douloureux ou intimes, on ne force jamais, on respecte les silences. On pose une seule question à la fois : deux questions ensemble, et le témoin n’en retient qu’une. Puis on laisse raconter librement : les détours d’un récit contiennent souvent des informations précieuses que le questionnaire n’avait pas prévues. Enfin, si le témoin s’éloigne trop longtemps du sujet, on recadre avec politesse : « C’est très intéressant — et à l’école, comment cela se passait-il ? ». À Madagascar, le respect dû aux aînés ajoute ses règles : saluer selon l’usage, se présenter, remercier, et demander la permission avant d’enregistrer.</w:t>
+        <w:t xml:space="preserve"> (« l’école pendant les années 1970 »), puis en une </w:t>
+      </w:r>
+      <w:r>
+        <w:rPr>
+          <w:b/>
+          <w:bCs/>
+          <w:i w:val="false"/>
+          <w:iCs w:val="false"/>
+          <w:color w:val="1F4E79"/>
+          <w:sz w:val="24"/>
+          <w:szCs w:val="24"/>
+          <w:rFonts w:ascii="Times New Roman" w:cs="Times New Roman" w:eastAsia="Times New Roman" w:hAnsi="Times New Roman"/>
+        </w:rPr>
+        <w:t xml:space="preserve">question d’enquête</w:t>
+      </w:r>
+      <w:r>
+        <w:rPr>
+          <w:b w:val="false"/>
+          <w:bCs w:val="false"/>
+          <w:i w:val="false"/>
+          <w:iCs w:val="false"/>
+          <w:color w:val="000000"/>
+          <w:sz w:val="24"/>
+          <w:szCs w:val="24"/>
+          <w:rFonts w:ascii="Times New Roman" w:cs="Times New Roman" w:eastAsia="Times New Roman" w:hAnsi="Times New Roman"/>
+        </w:rPr>
+        <w:t xml:space="preserve"> claire.</w:t>
+      </w:r>
+    </w:p>
+    <w:p>
+      <w:pPr>
+        <w:spacing w:after="100" w:line="300"/>
+        <w:jc w:val="both"/>
+      </w:pPr>
+      <w:r>
+        <w:rPr>
+          <w:b w:val="false"/>
+          <w:bCs w:val="false"/>
+          <w:i w:val="false"/>
+          <w:iCs w:val="false"/>
+          <w:color w:val="000000"/>
+          <w:sz w:val="24"/>
+          <w:szCs w:val="24"/>
+          <w:rFonts w:ascii="Times New Roman" w:cs="Times New Roman" w:eastAsia="Times New Roman" w:hAnsi="Times New Roman"/>
+        </w:rPr>
+        <w:t xml:space="preserve">Le groupe se concerte : qui pose les questions ? qui note ? qui enregistre ? qui surveille le temps ? Un entretien où tout le monde parle est un entretien perdu.</w:t>
+      </w:r>
+    </w:p>
+    <w:p>
+      <w:pPr>
+        <w:spacing w:after="80" w:line="300"/>
+        <w:jc w:val="both"/>
+      </w:pPr>
+      <w:r>
+        <w:rPr>
+          <w:b/>
+          <w:bCs/>
+          <w:i w:val="false"/>
+          <w:iCs w:val="false"/>
+          <w:color w:val="2E7D32"/>
+          <w:sz w:val="26"/>
+          <w:szCs w:val="26"/>
+          <w:rFonts w:ascii="Times New Roman" w:cs="Times New Roman" w:eastAsia="Times New Roman" w:hAnsi="Times New Roman"/>
+        </w:rPr>
+        <w:t xml:space="preserve">2. Pendant l’entretien : les cinq techniques</w:t>
+      </w:r>
+    </w:p>
+    <w:p>
+      <w:pPr>
+        <w:spacing w:after="100" w:line="300"/>
+        <w:jc w:val="both"/>
+      </w:pPr>
+      <w:r>
+        <w:rPr>
+          <w:b w:val="false"/>
+          <w:bCs w:val="false"/>
+          <w:i w:val="false"/>
+          <w:iCs w:val="false"/>
+          <w:color w:val="000000"/>
+          <w:sz w:val="24"/>
+          <w:szCs w:val="24"/>
+          <w:rFonts w:ascii="Times New Roman" w:cs="Times New Roman" w:eastAsia="Times New Roman" w:hAnsi="Times New Roman"/>
+        </w:rPr>
+        <w:t xml:space="preserve">Face au témoin, cinq règles font la réussite :</w:t>
+      </w:r>
+    </w:p>
+    <w:p>
+      <w:pPr>
+        <w:spacing w:after="60" w:line="300"/>
+        <w:jc w:val="both"/>
+      </w:pPr>
+      <w:r>
+        <w:rPr>
+          <w:b w:val="false"/>
+          <w:bCs w:val="false"/>
+          <w:i w:val="false"/>
+          <w:iCs w:val="false"/>
+          <w:color w:val="000000"/>
+          <w:sz w:val="24"/>
+          <w:szCs w:val="24"/>
+          <w:rFonts w:ascii="Times New Roman" w:cs="Times New Roman" w:eastAsia="Times New Roman" w:hAnsi="Times New Roman"/>
+        </w:rPr>
+        <w:t xml:space="preserve">• garder le </w:t>
+      </w:r>
+      <w:r>
+        <w:rPr>
+          <w:b/>
+          <w:bCs/>
+          <w:i w:val="false"/>
+          <w:iCs w:val="false"/>
+          <w:color w:val="1F4E79"/>
+          <w:sz w:val="24"/>
+          <w:szCs w:val="24"/>
+          <w:rFonts w:ascii="Times New Roman" w:cs="Times New Roman" w:eastAsia="Times New Roman" w:hAnsi="Times New Roman"/>
+        </w:rPr>
+        <w:t xml:space="preserve">contact visuel</w:t>
+      </w:r>
+      <w:r>
+        <w:rPr>
+          <w:b w:val="false"/>
+          <w:bCs w:val="false"/>
+          <w:i w:val="false"/>
+          <w:iCs w:val="false"/>
+          <w:color w:val="000000"/>
+          <w:sz w:val="24"/>
+          <w:szCs w:val="24"/>
+          <w:rFonts w:ascii="Times New Roman" w:cs="Times New Roman" w:eastAsia="Times New Roman" w:hAnsi="Times New Roman"/>
+        </w:rPr>
+        <w:t xml:space="preserve"> : les yeux dans le cahier, l’attention tombe — et le témoin aussi se décourage ;</w:t>
+      </w:r>
+    </w:p>
+    <w:p>
+      <w:pPr>
+        <w:spacing w:after="60" w:line="300"/>
+        <w:jc w:val="both"/>
+      </w:pPr>
+      <w:r>
+        <w:rPr>
+          <w:b w:val="false"/>
+          <w:bCs w:val="false"/>
+          <w:i w:val="false"/>
+          <w:iCs w:val="false"/>
+          <w:color w:val="000000"/>
+          <w:sz w:val="24"/>
+          <w:szCs w:val="24"/>
+          <w:rFonts w:ascii="Times New Roman" w:cs="Times New Roman" w:eastAsia="Times New Roman" w:hAnsi="Times New Roman"/>
+        </w:rPr>
+        <w:t xml:space="preserve">• faire preuve d’</w:t>
+      </w:r>
+      <w:r>
+        <w:rPr>
+          <w:b/>
+          <w:bCs/>
+          <w:i w:val="false"/>
+          <w:iCs w:val="false"/>
+          <w:color w:val="1F4E79"/>
+          <w:sz w:val="24"/>
+          <w:szCs w:val="24"/>
+          <w:rFonts w:ascii="Times New Roman" w:cs="Times New Roman" w:eastAsia="Times New Roman" w:hAnsi="Times New Roman"/>
+        </w:rPr>
+        <w:t xml:space="preserve">empathie</w:t>
+      </w:r>
+      <w:r>
+        <w:rPr>
+          <w:b w:val="false"/>
+          <w:bCs w:val="false"/>
+          <w:i w:val="false"/>
+          <w:iCs w:val="false"/>
+          <w:color w:val="000000"/>
+          <w:sz w:val="24"/>
+          <w:szCs w:val="24"/>
+          <w:rFonts w:ascii="Times New Roman" w:cs="Times New Roman" w:eastAsia="Times New Roman" w:hAnsi="Times New Roman"/>
+        </w:rPr>
+        <w:t xml:space="preserve"> : se mettre à la place du témoin ; certains souvenirs sont douloureux ou intimes, on ne force jamais, on respecte les silences ;</w:t>
+      </w:r>
+    </w:p>
+    <w:p>
+      <w:pPr>
+        <w:spacing w:after="60" w:line="300"/>
+        <w:jc w:val="both"/>
+      </w:pPr>
+      <w:r>
+        <w:rPr>
+          <w:b w:val="false"/>
+          <w:bCs w:val="false"/>
+          <w:i w:val="false"/>
+          <w:iCs w:val="false"/>
+          <w:color w:val="000000"/>
+          <w:sz w:val="24"/>
+          <w:szCs w:val="24"/>
+          <w:rFonts w:ascii="Times New Roman" w:cs="Times New Roman" w:eastAsia="Times New Roman" w:hAnsi="Times New Roman"/>
+        </w:rPr>
+        <w:t xml:space="preserve">• poser </w:t>
+      </w:r>
+      <w:r>
+        <w:rPr>
+          <w:b/>
+          <w:bCs/>
+          <w:i w:val="false"/>
+          <w:iCs w:val="false"/>
+          <w:color w:val="1F4E79"/>
+          <w:sz w:val="24"/>
+          <w:szCs w:val="24"/>
+          <w:rFonts w:ascii="Times New Roman" w:cs="Times New Roman" w:eastAsia="Times New Roman" w:hAnsi="Times New Roman"/>
+        </w:rPr>
+        <w:t xml:space="preserve">une seule question</w:t>
+      </w:r>
+      <w:r>
+        <w:rPr>
+          <w:b w:val="false"/>
+          <w:bCs w:val="false"/>
+          <w:i w:val="false"/>
+          <w:iCs w:val="false"/>
+          <w:color w:val="000000"/>
+          <w:sz w:val="24"/>
+          <w:szCs w:val="24"/>
+          <w:rFonts w:ascii="Times New Roman" w:cs="Times New Roman" w:eastAsia="Times New Roman" w:hAnsi="Times New Roman"/>
+        </w:rPr>
+        <w:t xml:space="preserve"> à la fois : deux questions ensemble, et le témoin n’en retient qu’une ;</w:t>
+      </w:r>
+    </w:p>
+    <w:p>
+      <w:pPr>
+        <w:spacing w:after="60" w:line="300"/>
+        <w:jc w:val="both"/>
+      </w:pPr>
+      <w:r>
+        <w:rPr>
+          <w:b w:val="false"/>
+          <w:bCs w:val="false"/>
+          <w:i w:val="false"/>
+          <w:iCs w:val="false"/>
+          <w:color w:val="000000"/>
+          <w:sz w:val="24"/>
+          <w:szCs w:val="24"/>
+          <w:rFonts w:ascii="Times New Roman" w:cs="Times New Roman" w:eastAsia="Times New Roman" w:hAnsi="Times New Roman"/>
+        </w:rPr>
+        <w:t xml:space="preserve">• laisser le témoin </w:t>
+      </w:r>
+      <w:r>
+        <w:rPr>
+          <w:b/>
+          <w:bCs/>
+          <w:i w:val="false"/>
+          <w:iCs w:val="false"/>
+          <w:color w:val="1F4E79"/>
+          <w:sz w:val="24"/>
+          <w:szCs w:val="24"/>
+          <w:rFonts w:ascii="Times New Roman" w:cs="Times New Roman" w:eastAsia="Times New Roman" w:hAnsi="Times New Roman"/>
+        </w:rPr>
+        <w:t xml:space="preserve">raconter librement</w:t>
+      </w:r>
+      <w:r>
+        <w:rPr>
+          <w:b w:val="false"/>
+          <w:bCs w:val="false"/>
+          <w:i w:val="false"/>
+          <w:iCs w:val="false"/>
+          <w:color w:val="000000"/>
+          <w:sz w:val="24"/>
+          <w:szCs w:val="24"/>
+          <w:rFonts w:ascii="Times New Roman" w:cs="Times New Roman" w:eastAsia="Times New Roman" w:hAnsi="Times New Roman"/>
+        </w:rPr>
+        <w:t xml:space="preserve"> : les détours d’un récit contiennent souvent des informations précieuses que le questionnaire n’avait pas prévues ;</w:t>
+      </w:r>
+    </w:p>
+    <w:p>
+      <w:pPr>
+        <w:spacing w:after="60" w:line="300"/>
+        <w:jc w:val="both"/>
+      </w:pPr>
+      <w:r>
+        <w:rPr>
+          <w:b w:val="false"/>
+          <w:bCs w:val="false"/>
+          <w:i w:val="false"/>
+          <w:iCs w:val="false"/>
+          <w:color w:val="000000"/>
+          <w:sz w:val="24"/>
+          <w:szCs w:val="24"/>
+          <w:rFonts w:ascii="Times New Roman" w:cs="Times New Roman" w:eastAsia="Times New Roman" w:hAnsi="Times New Roman"/>
+        </w:rPr>
+        <w:t xml:space="preserve">• </w:t>
+      </w:r>
+      <w:r>
+        <w:rPr>
+          <w:b/>
+          <w:bCs/>
+          <w:i w:val="false"/>
+          <w:iCs w:val="false"/>
+          <w:color w:val="1F4E79"/>
+          <w:sz w:val="24"/>
+          <w:szCs w:val="24"/>
+          <w:rFonts w:ascii="Times New Roman" w:cs="Times New Roman" w:eastAsia="Times New Roman" w:hAnsi="Times New Roman"/>
+        </w:rPr>
+        <w:t xml:space="preserve">recadrer</w:t>
+      </w:r>
+      <w:r>
+        <w:rPr>
+          <w:b w:val="false"/>
+          <w:bCs w:val="false"/>
+          <w:i w:val="false"/>
+          <w:iCs w:val="false"/>
+          <w:color w:val="000000"/>
+          <w:sz w:val="24"/>
+          <w:szCs w:val="24"/>
+          <w:rFonts w:ascii="Times New Roman" w:cs="Times New Roman" w:eastAsia="Times New Roman" w:hAnsi="Times New Roman"/>
+        </w:rPr>
+        <w:t xml:space="preserve"> avec politesse s’il s’éloigne trop longtemps du sujet : « C’est très intéressant — et à l’école, comment cela se passait-il ? ».</w:t>
+      </w:r>
+    </w:p>
+    <w:p>
+      <w:pPr>
+        <w:spacing w:after="80" w:line="300"/>
+        <w:jc w:val="both"/>
+      </w:pPr>
+      <w:r>
+        <w:rPr>
+          <w:b/>
+          <w:bCs/>
+          <w:i w:val="false"/>
+          <w:iCs w:val="false"/>
+          <w:color w:val="2E7D32"/>
+          <w:sz w:val="26"/>
+          <w:szCs w:val="26"/>
+          <w:rFonts w:ascii="Times New Roman" w:cs="Times New Roman" w:eastAsia="Times New Roman" w:hAnsi="Times New Roman"/>
+        </w:rPr>
+        <w:t xml:space="preserve">3. Le respect malgache des aînés</w:t>
+      </w:r>
+    </w:p>
+    <w:p>
+      <w:pPr>
+        <w:spacing w:after="100" w:line="300"/>
+        <w:jc w:val="both"/>
+      </w:pPr>
+      <w:r>
+        <w:rPr>
+          <w:b w:val="false"/>
+          <w:bCs w:val="false"/>
+          <w:i w:val="false"/>
+          <w:iCs w:val="false"/>
+          <w:color w:val="000000"/>
+          <w:sz w:val="24"/>
+          <w:szCs w:val="24"/>
+          <w:rFonts w:ascii="Times New Roman" w:cs="Times New Roman" w:eastAsia="Times New Roman" w:hAnsi="Times New Roman"/>
+        </w:rPr>
+        <w:t xml:space="preserve">À Madagascar, le respect dû aux aînés ajoute ses règles : saluer selon l’usage, se présenter, remercier, et demander la permission avant d’enregistrer.</w:t>
       </w:r>
     </w:p>
     <w:p>
@@ -3229,8 +3627,331 @@
     </w:p>
     <w:p>
       <w:pPr>
-        <w:spacing w:before="200" w:after="150"/>
-        <w:jc w:val="left"/>
+        <w:spacing w:after="120"/>
+      </w:pPr>
+    </w:p>
+    <w:tbl>
+      <w:tblPr>
+        <w:tblW w:type="dxa" w:w="9600"/>
+        <w:tblBorders>
+          <w:top w:val="single" w:color="B25000" w:sz="12"/>
+          <w:left w:val="single" w:color="B25000" w:sz="12"/>
+          <w:bottom w:val="single" w:color="B25000" w:sz="12"/>
+          <w:right w:val="single" w:color="B25000" w:sz="12"/>
+          <w:insideH w:val="none"/>
+          <w:insideV w:val="none"/>
+        </w:tblBorders>
+        <w:tblLayout w:type="fixed"/>
+      </w:tblPr>
+      <w:tblGrid>
+        <w:gridCol w:w="9600"/>
+      </w:tblGrid>
+      <w:tr>
+        <w:tc>
+          <w:tcPr>
+            <w:shd w:fill="FFF8EF" w:val="clear"/>
+            <w:tcMar>
+              <w:top w:type="dxa" w:w="140"/>
+              <w:left w:type="dxa" w:w="180"/>
+              <w:bottom w:type="dxa" w:w="140"/>
+              <w:right w:type="dxa" w:w="180"/>
+            </w:tcMar>
+          </w:tcPr>
+          <w:p>
+            <w:pPr>
+              <w:spacing w:after="90"/>
+            </w:pPr>
+            <w:r>
+              <w:rPr>
+                <w:b/>
+                <w:bCs/>
+                <w:i w:val="false"/>
+                <w:iCs w:val="false"/>
+                <w:color w:val="B25000"/>
+                <w:sz w:val="25"/>
+                <w:szCs w:val="25"/>
+                <w:rFonts w:ascii="Times New Roman" w:cs="Times New Roman" w:eastAsia="Times New Roman" w:hAnsi="Times New Roman"/>
+              </w:rPr>
+              <w:t xml:space="preserve">Document à étudier</w:t>
+            </w:r>
+          </w:p>
+          <w:p>
+            <w:pPr>
+              <w:spacing w:after="80" w:line="300"/>
+              <w:jc w:val="left"/>
+            </w:pPr>
+            <w:r>
+              <w:rPr>
+                <w:b/>
+                <w:bCs/>
+                <w:i w:val="false"/>
+                <w:iCs w:val="false"/>
+                <w:color w:val="000000"/>
+                <w:sz w:val="21"/>
+                <w:szCs w:val="21"/>
+                <w:rFonts w:ascii="Times New Roman" w:cs="Times New Roman" w:eastAsia="Times New Roman" w:hAnsi="Times New Roman"/>
+              </w:rPr>
+              <w:t xml:space="preserve">Les conseils du collecteur de mémoire — d’après les guides d’entretien des grandes archives d’Histoire orale — texte reconstitué</w:t>
+            </w:r>
+          </w:p>
+          <w:p>
+            <w:pPr>
+              <w:spacing w:after="100" w:line="300"/>
+              <w:jc w:val="both"/>
+            </w:pPr>
+            <w:r>
+              <w:rPr>
+                <w:b w:val="false"/>
+                <w:bCs w:val="false"/>
+                <w:i/>
+                <w:iCs/>
+                <w:color w:val="000000"/>
+                <w:sz w:val="24"/>
+                <w:szCs w:val="24"/>
+                <w:rFonts w:ascii="Times New Roman" w:cs="Times New Roman" w:eastAsia="Times New Roman" w:hAnsi="Times New Roman"/>
+              </w:rPr>
+              <w:t xml:space="preserve">« N’oubliez jamais que le témoin vous fait un don : celui de sa mémoire. Regardez-le pendant qu’il parle ; votre regard est son encouragement. Ne posez qu’une question, puis taisez-vous : le silence de l’enquêteur est son meilleur outil, car c’est dans les silences que remontent les souvenirs. Si le récit s’égare, ne coupez pas : attendez une respiration, et ramenez doucement votre interlocuteur au sujet. Et quand un souvenir fait trembler sa voix, n’insistez pas — un enquêteur n’est pas un juge. »</w:t>
+            </w:r>
+          </w:p>
+          <w:p>
+            <w:pPr>
+              <w:spacing w:after="40" w:line="300"/>
+              <w:jc w:val="both"/>
+            </w:pPr>
+            <w:r>
+              <w:rPr>
+                <w:b w:val="false"/>
+                <w:bCs w:val="false"/>
+                <w:i w:val="false"/>
+                <w:iCs w:val="false"/>
+                <w:color w:val="000000"/>
+                <w:sz w:val="24"/>
+                <w:szCs w:val="24"/>
+                <w:rFonts w:ascii="Times New Roman" w:cs="Times New Roman" w:eastAsia="Times New Roman" w:hAnsi="Times New Roman"/>
+              </w:rPr>
+              <w:t xml:space="preserve">1. Retrouve dans ce texte trois des cinq techniques de la leçon.</w:t>
+            </w:r>
+          </w:p>
+          <w:p>
+            <w:pPr>
+              <w:spacing w:after="40" w:line="300"/>
+              <w:jc w:val="both"/>
+            </w:pPr>
+            <w:r>
+              <w:rPr>
+                <w:b w:val="false"/>
+                <w:bCs w:val="false"/>
+                <w:i w:val="false"/>
+                <w:iCs w:val="false"/>
+                <w:color w:val="000000"/>
+                <w:sz w:val="24"/>
+                <w:szCs w:val="24"/>
+                <w:rFonts w:ascii="Times New Roman" w:cs="Times New Roman" w:eastAsia="Times New Roman" w:hAnsi="Times New Roman"/>
+              </w:rPr>
+              <w:t xml:space="preserve">2. Pourquoi le silence est-il appelé « le meilleur outil » de l’enquêteur ?</w:t>
+            </w:r>
+          </w:p>
+          <w:p>
+            <w:pPr>
+              <w:spacing w:after="40" w:line="300"/>
+              <w:jc w:val="both"/>
+            </w:pPr>
+            <w:r>
+              <w:rPr>
+                <w:b w:val="false"/>
+                <w:bCs w:val="false"/>
+                <w:i w:val="false"/>
+                <w:iCs w:val="false"/>
+                <w:color w:val="000000"/>
+                <w:sz w:val="24"/>
+                <w:szCs w:val="24"/>
+                <w:rFonts w:ascii="Times New Roman" w:cs="Times New Roman" w:eastAsia="Times New Roman" w:hAnsi="Times New Roman"/>
+              </w:rPr>
+              <w:t xml:space="preserve">3. Que signifie la dernière phrase : « un enquêteur n’est pas un juge » ?</w:t>
+            </w:r>
+          </w:p>
+          <w:p>
+            <w:pPr>
+              <w:spacing w:after="60"/>
+            </w:pPr>
+          </w:p>
+          <w:p>
+            <w:pPr>
+              <w:spacing w:after="40"/>
+            </w:pPr>
+            <w:r>
+              <w:rPr>
+                <w:b/>
+                <w:bCs/>
+                <w:i w:val="false"/>
+                <w:iCs w:val="false"/>
+                <w:color w:val="C2185B"/>
+                <w:sz w:val="22"/>
+                <w:szCs w:val="22"/>
+                <w:rFonts w:ascii="Times New Roman" w:cs="Times New Roman" w:eastAsia="Times New Roman" w:hAnsi="Times New Roman"/>
+              </w:rPr>
+              <w:t xml:space="preserve">Réponse 1. </w:t>
+            </w:r>
+            <w:r>
+              <w:rPr>
+                <w:b w:val="false"/>
+                <w:bCs w:val="false"/>
+                <w:i w:val="false"/>
+                <w:iCs w:val="false"/>
+                <w:color w:val="000000"/>
+                <w:sz w:val="22"/>
+                <w:szCs w:val="22"/>
+                <w:rFonts w:ascii="Times New Roman" w:cs="Times New Roman" w:eastAsia="Times New Roman" w:hAnsi="Times New Roman"/>
+              </w:rPr>
+              <w:t xml:space="preserve">Le contact visuel (« regardez-le »), une seule question à la fois, le recadrage poli (« ramenez doucement au sujet ») — et aussi l’empathie (« n’insistez pas »).</w:t>
+            </w:r>
+          </w:p>
+          <w:p>
+            <w:pPr>
+              <w:spacing w:after="40"/>
+            </w:pPr>
+            <w:r>
+              <w:rPr>
+                <w:b/>
+                <w:bCs/>
+                <w:i w:val="false"/>
+                <w:iCs w:val="false"/>
+                <w:color w:val="C2185B"/>
+                <w:sz w:val="22"/>
+                <w:szCs w:val="22"/>
+                <w:rFonts w:ascii="Times New Roman" w:cs="Times New Roman" w:eastAsia="Times New Roman" w:hAnsi="Times New Roman"/>
+              </w:rPr>
+              <w:t xml:space="preserve">Réponse 2. </w:t>
+            </w:r>
+            <w:r>
+              <w:rPr>
+                <w:b w:val="false"/>
+                <w:bCs w:val="false"/>
+                <w:i w:val="false"/>
+                <w:iCs w:val="false"/>
+                <w:color w:val="000000"/>
+                <w:sz w:val="22"/>
+                <w:szCs w:val="22"/>
+                <w:rFonts w:ascii="Times New Roman" w:cs="Times New Roman" w:eastAsia="Times New Roman" w:hAnsi="Times New Roman"/>
+              </w:rPr>
+              <w:t xml:space="preserve">Parce qu’il laisse le témoin raconter librement : c’est dans les silences que remontent les souvenirs imprévus et précieux.</w:t>
+            </w:r>
+          </w:p>
+          <w:p>
+            <w:pPr>
+              <w:spacing w:after="40"/>
+            </w:pPr>
+            <w:r>
+              <w:rPr>
+                <w:b/>
+                <w:bCs/>
+                <w:i w:val="false"/>
+                <w:iCs w:val="false"/>
+                <w:color w:val="C2185B"/>
+                <w:sz w:val="22"/>
+                <w:szCs w:val="22"/>
+                <w:rFonts w:ascii="Times New Roman" w:cs="Times New Roman" w:eastAsia="Times New Roman" w:hAnsi="Times New Roman"/>
+              </w:rPr>
+              <w:t xml:space="preserve">Réponse 3. </w:t>
+            </w:r>
+            <w:r>
+              <w:rPr>
+                <w:b w:val="false"/>
+                <w:bCs w:val="false"/>
+                <w:i w:val="false"/>
+                <w:iCs w:val="false"/>
+                <w:color w:val="000000"/>
+                <w:sz w:val="22"/>
+                <w:szCs w:val="22"/>
+                <w:rFonts w:ascii="Times New Roman" w:cs="Times New Roman" w:eastAsia="Times New Roman" w:hAnsi="Times New Roman"/>
+              </w:rPr>
+              <w:t xml:space="preserve">L’enquêteur ne force pas, n’accuse pas, ne vérifie pas en direct : il écoute avec empathie et respecte les émotions du témoin.</w:t>
+            </w:r>
+          </w:p>
+        </w:tc>
+      </w:tr>
+    </w:tbl>
+    <w:p>
+      <w:pPr>
+        <w:spacing w:after="160"/>
+      </w:pPr>
+    </w:p>
+    <w:tbl>
+      <w:tblPr>
+        <w:tblW w:type="dxa" w:w="9600"/>
+        <w:tblBorders>
+          <w:top w:val="single" w:color="1565C0" w:sz="12"/>
+          <w:left w:val="single" w:color="1565C0" w:sz="12"/>
+          <w:bottom w:val="single" w:color="1565C0" w:sz="12"/>
+          <w:right w:val="single" w:color="1565C0" w:sz="12"/>
+          <w:insideH w:val="none"/>
+          <w:insideV w:val="none"/>
+        </w:tblBorders>
+        <w:tblLayout w:type="fixed"/>
+      </w:tblPr>
+      <w:tblGrid>
+        <w:gridCol w:w="9600"/>
+      </w:tblGrid>
+      <w:tr>
+        <w:tc>
+          <w:tcPr>
+            <w:shd w:fill="E3F2FD" w:val="clear"/>
+            <w:tcMar>
+              <w:top w:type="dxa" w:w="140"/>
+              <w:left w:type="dxa" w:w="180"/>
+              <w:bottom w:type="dxa" w:w="140"/>
+              <w:right w:type="dxa" w:w="180"/>
+            </w:tcMar>
+          </w:tcPr>
+          <w:p>
+            <w:pPr>
+              <w:spacing w:after="90"/>
+            </w:pPr>
+            <w:r>
+              <w:rPr>
+                <w:b/>
+                <w:bCs/>
+                <w:i w:val="false"/>
+                <w:iCs w:val="false"/>
+                <w:color w:val="1565C0"/>
+                <w:sz w:val="25"/>
+                <w:szCs w:val="25"/>
+                <w:rFonts w:ascii="Times New Roman" w:cs="Times New Roman" w:eastAsia="Times New Roman" w:hAnsi="Times New Roman"/>
+              </w:rPr>
+              <w:t xml:space="preserve">Le savais-tu ?</w:t>
+            </w:r>
+          </w:p>
+          <w:p>
+            <w:pPr>
+              <w:spacing w:after="0" w:line="300"/>
+              <w:jc w:val="both"/>
+            </w:pPr>
+            <w:r>
+              <w:rPr>
+                <w:b w:val="false"/>
+                <w:bCs w:val="false"/>
+                <w:i w:val="false"/>
+                <w:iCs w:val="false"/>
+                <w:color w:val="000000"/>
+                <w:sz w:val="22"/>
+                <w:szCs w:val="22"/>
+                <w:rFonts w:ascii="Times New Roman" w:cs="Times New Roman" w:eastAsia="Times New Roman" w:hAnsi="Times New Roman"/>
+              </w:rPr>
+              <w:t xml:space="preserve">Les historiens professionnels utilisent exactement ces techniques ! Les grandes archives sonores du monde — comme celles des anciens combattants ou des survivants de catastrophes — ont été constituées par des milliers d’entretiens menés selon ces règles : une question à la fois, récit libre, respect du témoin. Ta petite enquête de classe suit la même méthode que les chercheurs des universités.</w:t>
+            </w:r>
+          </w:p>
+        </w:tc>
+      </w:tr>
+    </w:tbl>
+    <w:p>
+      <w:pPr>
+        <w:spacing w:after="160"/>
+      </w:pPr>
+    </w:p>
+    <w:p>
+      <w:pPr>
+        <w:spacing w:after="80" w:line="300"/>
+        <w:jc w:val="both"/>
       </w:pPr>
       <w:r>
         <w:rPr>
@@ -3239,166 +3960,337 @@
           <w:i w:val="false"/>
           <w:iCs w:val="false"/>
           <w:color w:val="2E7D32"/>
-          <w:sz w:val="28"/>
-          <w:szCs w:val="28"/>
-          <w:rFonts w:ascii="Times New Roman" w:cs="Times New Roman" w:eastAsia="Times New Roman" w:hAnsi="Times New Roman"/>
-        </w:rPr>
-        <w:t xml:space="preserve">Méthode</w:t>
-      </w:r>
-    </w:p>
-    <w:p>
-      <w:pPr>
-        <w:spacing w:after="60" w:line="300"/>
-        <w:jc w:val="both"/>
-      </w:pPr>
-      <w:r>
-        <w:rPr>
-          <w:b w:val="false"/>
-          <w:bCs w:val="false"/>
-          <w:i w:val="false"/>
-          <w:iCs w:val="false"/>
-          <w:color w:val="000000"/>
-          <w:sz w:val="24"/>
-          <w:szCs w:val="24"/>
-          <w:rFonts w:ascii="Times New Roman" w:cs="Times New Roman" w:eastAsia="Times New Roman" w:hAnsi="Times New Roman"/>
-        </w:rPr>
-        <w:t xml:space="preserve">1. Préciser le thème, l’objet et la question de l’enquête ; se répartir les rôles.</w:t>
-      </w:r>
-    </w:p>
-    <w:p>
-      <w:pPr>
-        <w:spacing w:after="60" w:line="300"/>
-        <w:jc w:val="both"/>
-      </w:pPr>
-      <w:r>
-        <w:rPr>
-          <w:b w:val="false"/>
-          <w:bCs w:val="false"/>
-          <w:i w:val="false"/>
-          <w:iCs w:val="false"/>
-          <w:color w:val="000000"/>
-          <w:sz w:val="24"/>
-          <w:szCs w:val="24"/>
-          <w:rFonts w:ascii="Times New Roman" w:cs="Times New Roman" w:eastAsia="Times New Roman" w:hAnsi="Times New Roman"/>
-        </w:rPr>
-        <w:t xml:space="preserve">2. Conduire l’entretien : regarder le témoin, écouter, une seule question à la fois.</w:t>
-      </w:r>
-    </w:p>
-    <w:p>
-      <w:pPr>
-        <w:spacing w:after="60" w:line="300"/>
-        <w:jc w:val="both"/>
-      </w:pPr>
-      <w:r>
-        <w:rPr>
-          <w:b w:val="false"/>
-          <w:bCs w:val="false"/>
-          <w:i w:val="false"/>
-          <w:iCs w:val="false"/>
-          <w:color w:val="000000"/>
-          <w:sz w:val="24"/>
-          <w:szCs w:val="24"/>
-          <w:rFonts w:ascii="Times New Roman" w:cs="Times New Roman" w:eastAsia="Times New Roman" w:hAnsi="Times New Roman"/>
-        </w:rPr>
-        <w:t xml:space="preserve">3. Laisser raconter librement, recadrer poliment, remercier et demander les permissions.</w:t>
-      </w:r>
-    </w:p>
-    <w:p>
-      <w:pPr>
-        <w:spacing w:after="110" w:line="300"/>
-        <w:jc w:val="both"/>
-      </w:pPr>
-      <w:r>
-        <w:rPr>
-          <w:b/>
-          <w:bCs/>
-          <w:i w:val="false"/>
-          <w:iCs w:val="false"/>
-          <w:color w:val="1F4E79"/>
-          <w:sz w:val="24"/>
-          <w:szCs w:val="24"/>
-          <w:rFonts w:ascii="Times New Roman" w:cs="Times New Roman" w:eastAsia="Times New Roman" w:hAnsi="Times New Roman"/>
-        </w:rPr>
-        <w:t xml:space="preserve">Exemple — </w:t>
-      </w:r>
-      <w:r>
-        <w:rPr>
-          <w:b w:val="false"/>
-          <w:bCs w:val="false"/>
-          <w:i w:val="false"/>
-          <w:iCs w:val="false"/>
-          <w:color w:val="000000"/>
-          <w:sz w:val="24"/>
-          <w:szCs w:val="24"/>
-          <w:rFonts w:ascii="Times New Roman" w:cs="Times New Roman" w:eastAsia="Times New Roman" w:hAnsi="Times New Roman"/>
-        </w:rPr>
-        <w:t xml:space="preserve">Enquête sur le marché communal : Vola pose les questions une à une en regardant la marchande ; Hery note ; Lova enregistre avec permission. Quand la marchande dérive vers la politique, Vola recadre : « Et les prix du riz à cette époque ? ».</w:t>
-      </w:r>
-    </w:p>
-    <w:p>
-      <w:pPr>
-        <w:spacing w:after="110" w:line="300"/>
-        <w:jc w:val="both"/>
-      </w:pPr>
-      <w:r>
-        <w:rPr>
-          <w:b/>
-          <w:bCs/>
-          <w:i w:val="false"/>
-          <w:iCs w:val="false"/>
-          <w:color w:val="B25000"/>
-          <w:sz w:val="24"/>
-          <w:szCs w:val="24"/>
-          <w:rFonts w:ascii="Times New Roman" w:cs="Times New Roman" w:eastAsia="Times New Roman" w:hAnsi="Times New Roman"/>
-        </w:rPr>
-        <w:t xml:space="preserve">Erreur à éviter — </w:t>
-      </w:r>
-      <w:r>
-        <w:rPr>
-          <w:b w:val="false"/>
-          <w:bCs w:val="false"/>
-          <w:i w:val="false"/>
-          <w:iCs w:val="false"/>
-          <w:color w:val="000000"/>
-          <w:sz w:val="24"/>
-          <w:szCs w:val="24"/>
-          <w:rFonts w:ascii="Times New Roman" w:cs="Times New Roman" w:eastAsia="Times New Roman" w:hAnsi="Times New Roman"/>
-        </w:rPr>
-        <w:t xml:space="preserve">Transformer l’entretien en interrogatoire : enchaîner les questions fermées (« oui ou non ? ») sans laisser le témoin raconter. Le témoignage devient sec et pauvre. L’entretien d’Histoire orale est une écoute guidée, pas un contrôle de connaissances.</w:t>
-      </w:r>
-    </w:p>
-    <w:p>
-      <w:pPr>
-        <w:shd w:fill="E3F2FD" w:val="clear"/>
-        <w:spacing w:after="110" w:line="300"/>
-        <w:jc w:val="both"/>
-      </w:pPr>
-      <w:r>
-        <w:rPr>
-          <w:b/>
-          <w:bCs/>
-          <w:i w:val="false"/>
-          <w:iCs w:val="false"/>
-          <w:color w:val="1565C0"/>
-          <w:sz w:val="24"/>
-          <w:szCs w:val="24"/>
-          <w:rFonts w:ascii="Times New Roman" w:cs="Times New Roman" w:eastAsia="Times New Roman" w:hAnsi="Times New Roman"/>
-        </w:rPr>
-        <w:t xml:space="preserve">Le savais-tu ? </w:t>
-      </w:r>
-      <w:r>
-        <w:rPr>
-          <w:b w:val="false"/>
-          <w:bCs w:val="false"/>
-          <w:i w:val="false"/>
-          <w:iCs w:val="false"/>
-          <w:color w:val="000000"/>
-          <w:sz w:val="24"/>
-          <w:szCs w:val="24"/>
-          <w:rFonts w:ascii="Times New Roman" w:cs="Times New Roman" w:eastAsia="Times New Roman" w:hAnsi="Times New Roman"/>
-        </w:rPr>
-        <w:t xml:space="preserve">Les historiens professionnels utilisent exactement ces techniques ! Les grandes archives sonores du monde — comme celles des anciens combattants ou des survivants de catastrophes — ont été constituées par des milliers d’entretiens menés selon ces règles : une question à la fois, récit libre, respect du témoin. Ta petite enquête de classe suit la même méthode que les chercheurs des universités.</w:t>
-      </w:r>
+          <w:sz w:val="26"/>
+          <w:szCs w:val="26"/>
+          <w:rFonts w:ascii="Times New Roman" w:cs="Times New Roman" w:eastAsia="Times New Roman" w:hAnsi="Times New Roman"/>
+        </w:rPr>
+        <w:t xml:space="preserve">Petit lexique</w:t>
+      </w:r>
+    </w:p>
+    <w:tbl>
+      <w:tblPr>
+        <w:tblW w:type="dxa" w:w="9600"/>
+        <w:tblBorders>
+          <w:top w:val="single" w:color="808080" w:sz="4"/>
+          <w:left w:val="single" w:color="808080" w:sz="4"/>
+          <w:bottom w:val="single" w:color="808080" w:sz="4"/>
+          <w:right w:val="single" w:color="808080" w:sz="4"/>
+          <w:insideH w:val="single" w:color="B0B0B0" w:sz="4"/>
+          <w:insideV w:val="single" w:color="B0B0B0" w:sz="4"/>
+        </w:tblBorders>
+        <w:tblLayout w:type="fixed"/>
+      </w:tblPr>
+      <w:tblGrid>
+        <w:gridCol w:w="2800"/>
+        <w:gridCol w:w="6800"/>
+      </w:tblGrid>
+      <w:tr>
+        <w:tc>
+          <w:tcPr>
+            <w:shd w:fill="E7E6E6" w:val="clear"/>
+            <w:tcMar>
+              <w:top w:type="dxa" w:w="80"/>
+              <w:left w:type="dxa" w:w="80"/>
+              <w:bottom w:type="dxa" w:w="80"/>
+              <w:right w:type="dxa" w:w="80"/>
+            </w:tcMar>
+          </w:tcPr>
+          <w:p>
+            <w:pPr>
+              <w:spacing w:after="40"/>
+              <w:jc w:val="left"/>
+            </w:pPr>
+            <w:r>
+              <w:rPr>
+                <w:b/>
+                <w:bCs/>
+                <w:i w:val="false"/>
+                <w:iCs w:val="false"/>
+                <w:color w:val="000000"/>
+                <w:sz w:val="20"/>
+                <w:szCs w:val="20"/>
+                <w:rFonts w:ascii="Times New Roman" w:cs="Times New Roman" w:eastAsia="Times New Roman" w:hAnsi="Times New Roman"/>
+              </w:rPr>
+              <w:t xml:space="preserve">Mot</w:t>
+            </w:r>
+          </w:p>
+        </w:tc>
+        <w:tc>
+          <w:tcPr>
+            <w:shd w:fill="E7E6E6" w:val="clear"/>
+            <w:tcMar>
+              <w:top w:type="dxa" w:w="80"/>
+              <w:left w:type="dxa" w:w="80"/>
+              <w:bottom w:type="dxa" w:w="80"/>
+              <w:right w:type="dxa" w:w="80"/>
+            </w:tcMar>
+          </w:tcPr>
+          <w:p>
+            <w:pPr>
+              <w:spacing w:after="40"/>
+              <w:jc w:val="left"/>
+            </w:pPr>
+            <w:r>
+              <w:rPr>
+                <w:b/>
+                <w:bCs/>
+                <w:i w:val="false"/>
+                <w:iCs w:val="false"/>
+                <w:color w:val="000000"/>
+                <w:sz w:val="20"/>
+                <w:szCs w:val="20"/>
+                <w:rFonts w:ascii="Times New Roman" w:cs="Times New Roman" w:eastAsia="Times New Roman" w:hAnsi="Times New Roman"/>
+              </w:rPr>
+              <w:t xml:space="preserve">Sens</w:t>
+            </w:r>
+          </w:p>
+        </w:tc>
+      </w:tr>
+      <w:tr>
+        <w:tc>
+          <w:tcPr>
+            <w:tcMar>
+              <w:top w:type="dxa" w:w="80"/>
+              <w:left w:type="dxa" w:w="80"/>
+              <w:bottom w:type="dxa" w:w="80"/>
+              <w:right w:type="dxa" w:w="80"/>
+            </w:tcMar>
+          </w:tcPr>
+          <w:p>
+            <w:pPr>
+              <w:spacing w:after="40"/>
+              <w:jc w:val="left"/>
+            </w:pPr>
+            <w:r>
+              <w:rPr>
+                <w:b/>
+                <w:bCs/>
+                <w:i w:val="false"/>
+                <w:iCs w:val="false"/>
+                <w:color w:val="000000"/>
+                <w:sz w:val="20"/>
+                <w:szCs w:val="20"/>
+                <w:rFonts w:ascii="Times New Roman" w:cs="Times New Roman" w:eastAsia="Times New Roman" w:hAnsi="Times New Roman"/>
+              </w:rPr>
+              <w:t xml:space="preserve">Enquête orale</w:t>
+            </w:r>
+          </w:p>
+        </w:tc>
+        <w:tc>
+          <w:tcPr>
+            <w:tcMar>
+              <w:top w:type="dxa" w:w="80"/>
+              <w:left w:type="dxa" w:w="80"/>
+              <w:bottom w:type="dxa" w:w="80"/>
+              <w:right w:type="dxa" w:w="80"/>
+            </w:tcMar>
+          </w:tcPr>
+          <w:p>
+            <w:pPr>
+              <w:spacing w:after="40"/>
+              <w:jc w:val="left"/>
+            </w:pPr>
+            <w:r>
+              <w:rPr>
+                <w:b w:val="false"/>
+                <w:bCs w:val="false"/>
+                <w:i w:val="false"/>
+                <w:iCs w:val="false"/>
+                <w:color w:val="000000"/>
+                <w:sz w:val="20"/>
+                <w:szCs w:val="20"/>
+                <w:rFonts w:ascii="Times New Roman" w:cs="Times New Roman" w:eastAsia="Times New Roman" w:hAnsi="Times New Roman"/>
+              </w:rPr>
+              <w:t xml:space="preserve">collecte d’informations historiques auprès de témoins</w:t>
+            </w:r>
+          </w:p>
+        </w:tc>
+      </w:tr>
+      <w:tr>
+        <w:tc>
+          <w:tcPr>
+            <w:tcMar>
+              <w:top w:type="dxa" w:w="80"/>
+              <w:left w:type="dxa" w:w="80"/>
+              <w:bottom w:type="dxa" w:w="80"/>
+              <w:right w:type="dxa" w:w="80"/>
+            </w:tcMar>
+          </w:tcPr>
+          <w:p>
+            <w:pPr>
+              <w:spacing w:after="40"/>
+              <w:jc w:val="left"/>
+            </w:pPr>
+            <w:r>
+              <w:rPr>
+                <w:b/>
+                <w:bCs/>
+                <w:i w:val="false"/>
+                <w:iCs w:val="false"/>
+                <w:color w:val="000000"/>
+                <w:sz w:val="20"/>
+                <w:szCs w:val="20"/>
+                <w:rFonts w:ascii="Times New Roman" w:cs="Times New Roman" w:eastAsia="Times New Roman" w:hAnsi="Times New Roman"/>
+              </w:rPr>
+              <w:t xml:space="preserve">Objet d’enquête</w:t>
+            </w:r>
+          </w:p>
+        </w:tc>
+        <w:tc>
+          <w:tcPr>
+            <w:tcMar>
+              <w:top w:type="dxa" w:w="80"/>
+              <w:left w:type="dxa" w:w="80"/>
+              <w:bottom w:type="dxa" w:w="80"/>
+              <w:right w:type="dxa" w:w="80"/>
+            </w:tcMar>
+          </w:tcPr>
+          <w:p>
+            <w:pPr>
+              <w:spacing w:after="40"/>
+              <w:jc w:val="left"/>
+            </w:pPr>
+            <w:r>
+              <w:rPr>
+                <w:b w:val="false"/>
+                <w:bCs w:val="false"/>
+                <w:i w:val="false"/>
+                <w:iCs w:val="false"/>
+                <w:color w:val="000000"/>
+                <w:sz w:val="20"/>
+                <w:szCs w:val="20"/>
+                <w:rFonts w:ascii="Times New Roman" w:cs="Times New Roman" w:eastAsia="Times New Roman" w:hAnsi="Times New Roman"/>
+              </w:rPr>
+              <w:t xml:space="preserve">aspect précis du thème que l’on étudie</w:t>
+            </w:r>
+          </w:p>
+        </w:tc>
+      </w:tr>
+      <w:tr>
+        <w:tc>
+          <w:tcPr>
+            <w:tcMar>
+              <w:top w:type="dxa" w:w="80"/>
+              <w:left w:type="dxa" w:w="80"/>
+              <w:bottom w:type="dxa" w:w="80"/>
+              <w:right w:type="dxa" w:w="80"/>
+            </w:tcMar>
+          </w:tcPr>
+          <w:p>
+            <w:pPr>
+              <w:spacing w:after="40"/>
+              <w:jc w:val="left"/>
+            </w:pPr>
+            <w:r>
+              <w:rPr>
+                <w:b/>
+                <w:bCs/>
+                <w:i w:val="false"/>
+                <w:iCs w:val="false"/>
+                <w:color w:val="000000"/>
+                <w:sz w:val="20"/>
+                <w:szCs w:val="20"/>
+                <w:rFonts w:ascii="Times New Roman" w:cs="Times New Roman" w:eastAsia="Times New Roman" w:hAnsi="Times New Roman"/>
+              </w:rPr>
+              <w:t xml:space="preserve">Empathie</w:t>
+            </w:r>
+          </w:p>
+        </w:tc>
+        <w:tc>
+          <w:tcPr>
+            <w:tcMar>
+              <w:top w:type="dxa" w:w="80"/>
+              <w:left w:type="dxa" w:w="80"/>
+              <w:bottom w:type="dxa" w:w="80"/>
+              <w:right w:type="dxa" w:w="80"/>
+            </w:tcMar>
+          </w:tcPr>
+          <w:p>
+            <w:pPr>
+              <w:spacing w:after="40"/>
+              <w:jc w:val="left"/>
+            </w:pPr>
+            <w:r>
+              <w:rPr>
+                <w:b w:val="false"/>
+                <w:bCs w:val="false"/>
+                <w:i w:val="false"/>
+                <w:iCs w:val="false"/>
+                <w:color w:val="000000"/>
+                <w:sz w:val="20"/>
+                <w:szCs w:val="20"/>
+                <w:rFonts w:ascii="Times New Roman" w:cs="Times New Roman" w:eastAsia="Times New Roman" w:hAnsi="Times New Roman"/>
+              </w:rPr>
+              <w:t xml:space="preserve">capacité à se mettre à la place du témoin</w:t>
+            </w:r>
+          </w:p>
+        </w:tc>
+      </w:tr>
+      <w:tr>
+        <w:tc>
+          <w:tcPr>
+            <w:tcMar>
+              <w:top w:type="dxa" w:w="80"/>
+              <w:left w:type="dxa" w:w="80"/>
+              <w:bottom w:type="dxa" w:w="80"/>
+              <w:right w:type="dxa" w:w="80"/>
+            </w:tcMar>
+          </w:tcPr>
+          <w:p>
+            <w:pPr>
+              <w:spacing w:after="40"/>
+              <w:jc w:val="left"/>
+            </w:pPr>
+            <w:r>
+              <w:rPr>
+                <w:b/>
+                <w:bCs/>
+                <w:i w:val="false"/>
+                <w:iCs w:val="false"/>
+                <w:color w:val="000000"/>
+                <w:sz w:val="20"/>
+                <w:szCs w:val="20"/>
+                <w:rFonts w:ascii="Times New Roman" w:cs="Times New Roman" w:eastAsia="Times New Roman" w:hAnsi="Times New Roman"/>
+              </w:rPr>
+              <w:t xml:space="preserve">Recadrer</w:t>
+            </w:r>
+          </w:p>
+        </w:tc>
+        <w:tc>
+          <w:tcPr>
+            <w:tcMar>
+              <w:top w:type="dxa" w:w="80"/>
+              <w:left w:type="dxa" w:w="80"/>
+              <w:bottom w:type="dxa" w:w="80"/>
+              <w:right w:type="dxa" w:w="80"/>
+            </w:tcMar>
+          </w:tcPr>
+          <w:p>
+            <w:pPr>
+              <w:spacing w:after="40"/>
+              <w:jc w:val="left"/>
+            </w:pPr>
+            <w:r>
+              <w:rPr>
+                <w:b w:val="false"/>
+                <w:bCs w:val="false"/>
+                <w:i w:val="false"/>
+                <w:iCs w:val="false"/>
+                <w:color w:val="000000"/>
+                <w:sz w:val="20"/>
+                <w:szCs w:val="20"/>
+                <w:rFonts w:ascii="Times New Roman" w:cs="Times New Roman" w:eastAsia="Times New Roman" w:hAnsi="Times New Roman"/>
+              </w:rPr>
+              <w:t xml:space="preserve">ramener poliment le témoin au sujet de l’enquête</w:t>
+            </w:r>
+          </w:p>
+        </w:tc>
+      </w:tr>
+    </w:tbl>
+    <w:p>
+      <w:pPr>
+        <w:spacing w:after="120"/>
+      </w:pPr>
     </w:p>
     <w:p>
       <w:pPr>
@@ -5062,152 +5954,152 @@
                 <w:szCs w:val="20"/>
                 <w:rFonts w:ascii="Times New Roman" w:cs="Times New Roman" w:eastAsia="Times New Roman" w:hAnsi="Times New Roman"/>
               </w:rPr>
-              <w:t xml:space="preserve">3. Observation</w:t>
-            </w:r>
-          </w:p>
-        </w:tc>
-        <w:tc>
-          <w:tcPr>
-            <w:tcMar>
-              <w:top w:type="dxa" w:w="80"/>
-              <w:left w:type="dxa" w:w="80"/>
-              <w:bottom w:type="dxa" w:w="80"/>
-              <w:right w:type="dxa" w:w="80"/>
-            </w:tcMar>
-          </w:tcPr>
-          <w:p>
-            <w:pPr>
-              <w:spacing w:after="40"/>
-              <w:jc w:val="left"/>
-            </w:pPr>
-            <w:r>
-              <w:rPr>
-                <w:b w:val="false"/>
-                <w:bCs w:val="false"/>
-                <w:i w:val="false"/>
-                <w:iCs w:val="false"/>
-                <w:color w:val="000000"/>
-                <w:sz w:val="20"/>
-                <w:szCs w:val="20"/>
-                <w:rFonts w:ascii="Times New Roman" w:cs="Times New Roman" w:eastAsia="Times New Roman" w:hAnsi="Times New Roman"/>
-              </w:rPr>
-              <w:t xml:space="preserve">Dadabe affirme que l’école a brûlé « vers 1975 ». Le registre communal indique l’incendie en 1977. La classe retient 1977 en signalant l’écart : le recoupement a corrigé la mémoire sans disqualifier le témoin.</w:t>
-            </w:r>
-          </w:p>
-        </w:tc>
-        <w:tc>
-          <w:tcPr>
-            <w:tcMar>
-              <w:top w:type="dxa" w:w="80"/>
-              <w:left w:type="dxa" w:w="80"/>
-              <w:bottom w:type="dxa" w:w="80"/>
-              <w:right w:type="dxa" w:w="80"/>
-            </w:tcMar>
-          </w:tcPr>
-          <w:p>
-            <w:pPr>
-              <w:spacing w:after="40"/>
-              <w:jc w:val="left"/>
-            </w:pPr>
-            <w:r>
-              <w:rPr>
-                <w:b w:val="false"/>
-                <w:bCs w:val="false"/>
-                <w:i w:val="false"/>
-                <w:iCs w:val="false"/>
-                <w:color w:val="000000"/>
-                <w:sz w:val="20"/>
-                <w:szCs w:val="20"/>
-                <w:rFonts w:ascii="Times New Roman" w:cs="Times New Roman" w:eastAsia="Times New Roman" w:hAnsi="Times New Roman"/>
-              </w:rPr>
-              <w:t xml:space="preserve">Observent l’exemple résolu.</w:t>
-            </w:r>
-          </w:p>
-        </w:tc>
-        <w:tc>
-          <w:tcPr>
-            <w:tcMar>
-              <w:top w:type="dxa" w:w="80"/>
-              <w:left w:type="dxa" w:w="80"/>
-              <w:bottom w:type="dxa" w:w="80"/>
-              <w:right w:type="dxa" w:w="80"/>
-            </w:tcMar>
-          </w:tcPr>
-          <w:p>
-            <w:pPr>
-              <w:spacing w:after="40"/>
-              <w:jc w:val="left"/>
-            </w:pPr>
-            <w:r>
-              <w:rPr>
-                <w:b w:val="false"/>
-                <w:bCs w:val="false"/>
-                <w:i w:val="false"/>
-                <w:iCs w:val="false"/>
-                <w:color w:val="000000"/>
-                <w:sz w:val="20"/>
-                <w:szCs w:val="20"/>
-                <w:rFonts w:ascii="Times New Roman" w:cs="Times New Roman" w:eastAsia="Times New Roman" w:hAnsi="Times New Roman"/>
-              </w:rPr>
-              <w:t xml:space="preserve">Observation dirigée</w:t>
-            </w:r>
-          </w:p>
-        </w:tc>
-        <w:tc>
-          <w:tcPr>
-            <w:tcMar>
-              <w:top w:type="dxa" w:w="80"/>
-              <w:left w:type="dxa" w:w="80"/>
-              <w:bottom w:type="dxa" w:w="80"/>
-              <w:right w:type="dxa" w:w="80"/>
-            </w:tcMar>
-          </w:tcPr>
-          <w:p>
-            <w:pPr>
-              <w:spacing w:after="40"/>
-              <w:jc w:val="left"/>
-            </w:pPr>
-            <w:r>
-              <w:rPr>
-                <w:b w:val="false"/>
-                <w:bCs w:val="false"/>
-                <w:i w:val="false"/>
-                <w:iCs w:val="false"/>
-                <w:color w:val="000000"/>
-                <w:sz w:val="20"/>
-                <w:szCs w:val="20"/>
-                <w:rFonts w:ascii="Times New Roman" w:cs="Times New Roman" w:eastAsia="Times New Roman" w:hAnsi="Times New Roman"/>
-              </w:rPr>
-              <w:t xml:space="preserve">Document imprimé</w:t>
-            </w:r>
-          </w:p>
-        </w:tc>
-        <w:tc>
-          <w:tcPr>
-            <w:tcMar>
-              <w:top w:type="dxa" w:w="80"/>
-              <w:left w:type="dxa" w:w="80"/>
-              <w:bottom w:type="dxa" w:w="80"/>
-              <w:right w:type="dxa" w:w="80"/>
-            </w:tcMar>
-          </w:tcPr>
-          <w:p>
-            <w:pPr>
-              <w:spacing w:after="40"/>
-              <w:jc w:val="left"/>
-            </w:pPr>
-            <w:r>
-              <w:rPr>
-                <w:b w:val="false"/>
-                <w:bCs w:val="false"/>
-                <w:i w:val="false"/>
-                <w:iCs w:val="false"/>
-                <w:color w:val="000000"/>
-                <w:sz w:val="20"/>
-                <w:szCs w:val="20"/>
-                <w:rFonts w:ascii="Times New Roman" w:cs="Times New Roman" w:eastAsia="Times New Roman" w:hAnsi="Times New Roman"/>
-              </w:rPr>
-              <w:t xml:space="preserve">Compréhension</w:t>
+              <w:t xml:space="preserve">3. Développement</w:t>
+            </w:r>
+          </w:p>
+        </w:tc>
+        <w:tc>
+          <w:tcPr>
+            <w:tcMar>
+              <w:top w:type="dxa" w:w="80"/>
+              <w:left w:type="dxa" w:w="80"/>
+              <w:bottom w:type="dxa" w:w="80"/>
+              <w:right w:type="dxa" w:w="80"/>
+            </w:tcMar>
+          </w:tcPr>
+          <w:p>
+            <w:pPr>
+              <w:spacing w:after="40"/>
+              <w:jc w:val="left"/>
+            </w:pPr>
+            <w:r>
+              <w:rPr>
+                <w:b w:val="false"/>
+                <w:bCs w:val="false"/>
+                <w:i w:val="false"/>
+                <w:iCs w:val="false"/>
+                <w:color w:val="000000"/>
+                <w:sz w:val="20"/>
+                <w:szCs w:val="20"/>
+                <w:rFonts w:ascii="Times New Roman" w:cs="Times New Roman" w:eastAsia="Times New Roman" w:hAnsi="Times New Roman"/>
+              </w:rPr>
+              <w:t xml:space="preserve">Développe la leçon partie par partie : De la problématique à la retranscription ; Analyser et recouper : le travail de l’historien ; Le dossier et la présentation.</w:t>
+            </w:r>
+          </w:p>
+        </w:tc>
+        <w:tc>
+          <w:tcPr>
+            <w:tcMar>
+              <w:top w:type="dxa" w:w="80"/>
+              <w:left w:type="dxa" w:w="80"/>
+              <w:bottom w:type="dxa" w:w="80"/>
+              <w:right w:type="dxa" w:w="80"/>
+            </w:tcMar>
+          </w:tcPr>
+          <w:p>
+            <w:pPr>
+              <w:spacing w:after="40"/>
+              <w:jc w:val="left"/>
+            </w:pPr>
+            <w:r>
+              <w:rPr>
+                <w:b w:val="false"/>
+                <w:bCs w:val="false"/>
+                <w:i w:val="false"/>
+                <w:iCs w:val="false"/>
+                <w:color w:val="000000"/>
+                <w:sz w:val="20"/>
+                <w:szCs w:val="20"/>
+                <w:rFonts w:ascii="Times New Roman" w:cs="Times New Roman" w:eastAsia="Times New Roman" w:hAnsi="Times New Roman"/>
+              </w:rPr>
+              <w:t xml:space="preserve">Écoutent, répondent aux questions et notent les mots-clés.</w:t>
+            </w:r>
+          </w:p>
+        </w:tc>
+        <w:tc>
+          <w:tcPr>
+            <w:tcMar>
+              <w:top w:type="dxa" w:w="80"/>
+              <w:left w:type="dxa" w:w="80"/>
+              <w:bottom w:type="dxa" w:w="80"/>
+              <w:right w:type="dxa" w:w="80"/>
+            </w:tcMar>
+          </w:tcPr>
+          <w:p>
+            <w:pPr>
+              <w:spacing w:after="40"/>
+              <w:jc w:val="left"/>
+            </w:pPr>
+            <w:r>
+              <w:rPr>
+                <w:b w:val="false"/>
+                <w:bCs w:val="false"/>
+                <w:i w:val="false"/>
+                <w:iCs w:val="false"/>
+                <w:color w:val="000000"/>
+                <w:sz w:val="20"/>
+                <w:szCs w:val="20"/>
+                <w:rFonts w:ascii="Times New Roman" w:cs="Times New Roman" w:eastAsia="Times New Roman" w:hAnsi="Times New Roman"/>
+              </w:rPr>
+              <w:t xml:space="preserve">Exposé interactif, questions-réponses</w:t>
+            </w:r>
+          </w:p>
+        </w:tc>
+        <w:tc>
+          <w:tcPr>
+            <w:tcMar>
+              <w:top w:type="dxa" w:w="80"/>
+              <w:left w:type="dxa" w:w="80"/>
+              <w:bottom w:type="dxa" w:w="80"/>
+              <w:right w:type="dxa" w:w="80"/>
+            </w:tcMar>
+          </w:tcPr>
+          <w:p>
+            <w:pPr>
+              <w:spacing w:after="40"/>
+              <w:jc w:val="left"/>
+            </w:pPr>
+            <w:r>
+              <w:rPr>
+                <w:b w:val="false"/>
+                <w:bCs w:val="false"/>
+                <w:i w:val="false"/>
+                <w:iCs w:val="false"/>
+                <w:color w:val="000000"/>
+                <w:sz w:val="20"/>
+                <w:szCs w:val="20"/>
+                <w:rFonts w:ascii="Times New Roman" w:cs="Times New Roman" w:eastAsia="Times New Roman" w:hAnsi="Times New Roman"/>
+              </w:rPr>
+              <w:t xml:space="preserve">Tableau, frises, cartes</w:t>
+            </w:r>
+          </w:p>
+        </w:tc>
+        <w:tc>
+          <w:tcPr>
+            <w:tcMar>
+              <w:top w:type="dxa" w:w="80"/>
+              <w:left w:type="dxa" w:w="80"/>
+              <w:bottom w:type="dxa" w:w="80"/>
+              <w:right w:type="dxa" w:w="80"/>
+            </w:tcMar>
+          </w:tcPr>
+          <w:p>
+            <w:pPr>
+              <w:spacing w:after="40"/>
+              <w:jc w:val="left"/>
+            </w:pPr>
+            <w:r>
+              <w:rPr>
+                <w:b w:val="false"/>
+                <w:bCs w:val="false"/>
+                <w:i w:val="false"/>
+                <w:iCs w:val="false"/>
+                <w:color w:val="000000"/>
+                <w:sz w:val="20"/>
+                <w:szCs w:val="20"/>
+                <w:rFonts w:ascii="Times New Roman" w:cs="Times New Roman" w:eastAsia="Times New Roman" w:hAnsi="Times New Roman"/>
+              </w:rPr>
+              <w:t xml:space="preserve">Attention, participation</w:t>
             </w:r>
           </w:p>
         </w:tc>
@@ -5238,152 +6130,152 @@
                 <w:szCs w:val="20"/>
                 <w:rFonts w:ascii="Times New Roman" w:cs="Times New Roman" w:eastAsia="Times New Roman" w:hAnsi="Times New Roman"/>
               </w:rPr>
-              <w:t xml:space="preserve">4. Analyse</w:t>
-            </w:r>
-          </w:p>
-        </w:tc>
-        <w:tc>
-          <w:tcPr>
-            <w:tcMar>
-              <w:top w:type="dxa" w:w="80"/>
-              <w:left w:type="dxa" w:w="80"/>
-              <w:bottom w:type="dxa" w:w="80"/>
-              <w:right w:type="dxa" w:w="80"/>
-            </w:tcMar>
-          </w:tcPr>
-          <w:p>
-            <w:pPr>
-              <w:spacing w:after="40"/>
-              <w:jc w:val="left"/>
-            </w:pPr>
-            <w:r>
-              <w:rPr>
-                <w:b w:val="false"/>
-                <w:bCs w:val="false"/>
-                <w:i w:val="false"/>
-                <w:iCs w:val="false"/>
-                <w:color w:val="000000"/>
-                <w:sz w:val="20"/>
-                <w:szCs w:val="20"/>
-                <w:rFonts w:ascii="Times New Roman" w:cs="Times New Roman" w:eastAsia="Times New Roman" w:hAnsi="Times New Roman"/>
-              </w:rPr>
-              <w:t xml:space="preserve">Guide l’analyse : La problématique est la boussole du projet : « Comment l’école de notre commune a-t-elle changé entre 1970 et 1990 ? ». La grille d’entretien liste les questions qui en découlent. Après l’entretien vient la retranscription : écrire fidèlement les paroles du témoin, sans rien ajouter ni corriger — même les hésitations peuvent avoir un sens. Puis l’analyse : que répond le témoignage à la problématique ? Qu’apprend-on de neuf ? Qu’est-ce qui reste obscur ? Vient alors l’étape qui fait de l’élève un vrai historien : le recoupement. La mémoire peut se tromper — dates mélangées, souvenirs embellis. On confronte donc le témoignage à des sources écrites (registres, journaux, photographies datées) et à d’autres témoignages : ce qui concorde est solide ; ce qui diverge appelle la prudence. Enfin, le dossier rassemble tout : problématique, grille, retranscriptions, analyse, conclusion, et la présentation orale restitue le travail devant la classe. Ce dossier devient à son tour une source : dans vingt ans, un chercheur pourra s’en servir. La boucle de l’Histoire orale est bouclée — l’esprit d’analyse et l’esprit critique en sont les deux piliers.</w:t>
-            </w:r>
-          </w:p>
-        </w:tc>
-        <w:tc>
-          <w:tcPr>
-            <w:tcMar>
-              <w:top w:type="dxa" w:w="80"/>
-              <w:left w:type="dxa" w:w="80"/>
-              <w:bottom w:type="dxa" w:w="80"/>
-              <w:right w:type="dxa" w:w="80"/>
-            </w:tcMar>
-          </w:tcPr>
-          <w:p>
-            <w:pPr>
-              <w:spacing w:after="40"/>
-              <w:jc w:val="left"/>
-            </w:pPr>
-            <w:r>
-              <w:rPr>
-                <w:b w:val="false"/>
-                <w:bCs w:val="false"/>
-                <w:i w:val="false"/>
-                <w:iCs w:val="false"/>
-                <w:color w:val="000000"/>
-                <w:sz w:val="20"/>
-                <w:szCs w:val="20"/>
-                <w:rFonts w:ascii="Times New Roman" w:cs="Times New Roman" w:eastAsia="Times New Roman" w:hAnsi="Times New Roman"/>
-              </w:rPr>
-              <w:t xml:space="preserve">Expliquent la démarche et vérifient le résultat.</w:t>
-            </w:r>
-          </w:p>
-        </w:tc>
-        <w:tc>
-          <w:tcPr>
-            <w:tcMar>
-              <w:top w:type="dxa" w:w="80"/>
-              <w:left w:type="dxa" w:w="80"/>
-              <w:bottom w:type="dxa" w:w="80"/>
-              <w:right w:type="dxa" w:w="80"/>
-            </w:tcMar>
-          </w:tcPr>
-          <w:p>
-            <w:pPr>
-              <w:spacing w:after="40"/>
-              <w:jc w:val="left"/>
-            </w:pPr>
-            <w:r>
-              <w:rPr>
-                <w:b w:val="false"/>
-                <w:bCs w:val="false"/>
-                <w:i w:val="false"/>
-                <w:iCs w:val="false"/>
-                <w:color w:val="000000"/>
-                <w:sz w:val="20"/>
-                <w:szCs w:val="20"/>
-                <w:rFonts w:ascii="Times New Roman" w:cs="Times New Roman" w:eastAsia="Times New Roman" w:hAnsi="Times New Roman"/>
-              </w:rPr>
-              <w:t xml:space="preserve">Recherche en binômes</w:t>
-            </w:r>
-          </w:p>
-        </w:tc>
-        <w:tc>
-          <w:tcPr>
-            <w:tcMar>
-              <w:top w:type="dxa" w:w="80"/>
-              <w:left w:type="dxa" w:w="80"/>
-              <w:bottom w:type="dxa" w:w="80"/>
-              <w:right w:type="dxa" w:w="80"/>
-            </w:tcMar>
-          </w:tcPr>
-          <w:p>
-            <w:pPr>
-              <w:spacing w:after="40"/>
-              <w:jc w:val="left"/>
-            </w:pPr>
-            <w:r>
-              <w:rPr>
-                <w:b w:val="false"/>
-                <w:bCs w:val="false"/>
-                <w:i w:val="false"/>
-                <w:iCs w:val="false"/>
-                <w:color w:val="000000"/>
-                <w:sz w:val="20"/>
-                <w:szCs w:val="20"/>
-                <w:rFonts w:ascii="Times New Roman" w:cs="Times New Roman" w:eastAsia="Times New Roman" w:hAnsi="Times New Roman"/>
-              </w:rPr>
-              <w:t xml:space="preserve">Documents, cartes, frises</w:t>
-            </w:r>
-          </w:p>
-        </w:tc>
-        <w:tc>
-          <w:tcPr>
-            <w:tcMar>
-              <w:top w:type="dxa" w:w="80"/>
-              <w:left w:type="dxa" w:w="80"/>
-              <w:bottom w:type="dxa" w:w="80"/>
-              <w:right w:type="dxa" w:w="80"/>
-            </w:tcMar>
-          </w:tcPr>
-          <w:p>
-            <w:pPr>
-              <w:spacing w:after="40"/>
-              <w:jc w:val="left"/>
-            </w:pPr>
-            <w:r>
-              <w:rPr>
-                <w:b w:val="false"/>
-                <w:bCs w:val="false"/>
-                <w:i w:val="false"/>
-                <w:iCs w:val="false"/>
-                <w:color w:val="000000"/>
-                <w:sz w:val="20"/>
-                <w:szCs w:val="20"/>
-                <w:rFonts w:ascii="Times New Roman" w:cs="Times New Roman" w:eastAsia="Times New Roman" w:hAnsi="Times New Roman"/>
-              </w:rPr>
-              <w:t xml:space="preserve">Raisonnement</w:t>
+              <w:t xml:space="preserve">4. Étude de document</w:t>
+            </w:r>
+          </w:p>
+        </w:tc>
+        <w:tc>
+          <w:tcPr>
+            <w:tcMar>
+              <w:top w:type="dxa" w:w="80"/>
+              <w:left w:type="dxa" w:w="80"/>
+              <w:bottom w:type="dxa" w:w="80"/>
+              <w:right w:type="dxa" w:w="80"/>
+            </w:tcMar>
+          </w:tcPr>
+          <w:p>
+            <w:pPr>
+              <w:spacing w:after="40"/>
+              <w:jc w:val="left"/>
+            </w:pPr>
+            <w:r>
+              <w:rPr>
+                <w:b w:val="false"/>
+                <w:bCs w:val="false"/>
+                <w:i w:val="false"/>
+                <w:iCs w:val="false"/>
+                <w:color w:val="000000"/>
+                <w:sz w:val="20"/>
+                <w:szCs w:val="20"/>
+                <w:rFonts w:ascii="Times New Roman" w:cs="Times New Roman" w:eastAsia="Times New Roman" w:hAnsi="Times New Roman"/>
+              </w:rPr>
+              <w:t xml:space="preserve">Fait lire le document « Comment fut fabriqué le Tantara ny Andriana » (d’après la démarche exposée par le R.P. François Callet, Tantara ny Andriana (1878) — extrait adapté), puis pose les questions.</w:t>
+            </w:r>
+          </w:p>
+        </w:tc>
+        <w:tc>
+          <w:tcPr>
+            <w:tcMar>
+              <w:top w:type="dxa" w:w="80"/>
+              <w:left w:type="dxa" w:w="80"/>
+              <w:bottom w:type="dxa" w:w="80"/>
+              <w:right w:type="dxa" w:w="80"/>
+            </w:tcMar>
+          </w:tcPr>
+          <w:p>
+            <w:pPr>
+              <w:spacing w:after="40"/>
+              <w:jc w:val="left"/>
+            </w:pPr>
+            <w:r>
+              <w:rPr>
+                <w:b w:val="false"/>
+                <w:bCs w:val="false"/>
+                <w:i w:val="false"/>
+                <w:iCs w:val="false"/>
+                <w:color w:val="000000"/>
+                <w:sz w:val="20"/>
+                <w:szCs w:val="20"/>
+                <w:rFonts w:ascii="Times New Roman" w:cs="Times New Roman" w:eastAsia="Times New Roman" w:hAnsi="Times New Roman"/>
+              </w:rPr>
+              <w:t xml:space="preserve">Lisent le document, répondent aux questions et critiquent la source.</w:t>
+            </w:r>
+          </w:p>
+        </w:tc>
+        <w:tc>
+          <w:tcPr>
+            <w:tcMar>
+              <w:top w:type="dxa" w:w="80"/>
+              <w:left w:type="dxa" w:w="80"/>
+              <w:bottom w:type="dxa" w:w="80"/>
+              <w:right w:type="dxa" w:w="80"/>
+            </w:tcMar>
+          </w:tcPr>
+          <w:p>
+            <w:pPr>
+              <w:spacing w:after="40"/>
+              <w:jc w:val="left"/>
+            </w:pPr>
+            <w:r>
+              <w:rPr>
+                <w:b w:val="false"/>
+                <w:bCs w:val="false"/>
+                <w:i w:val="false"/>
+                <w:iCs w:val="false"/>
+                <w:color w:val="000000"/>
+                <w:sz w:val="20"/>
+                <w:szCs w:val="20"/>
+                <w:rFonts w:ascii="Times New Roman" w:cs="Times New Roman" w:eastAsia="Times New Roman" w:hAnsi="Times New Roman"/>
+              </w:rPr>
+              <w:t xml:space="preserve">Observation dirigée, travail en binômes</w:t>
+            </w:r>
+          </w:p>
+        </w:tc>
+        <w:tc>
+          <w:tcPr>
+            <w:tcMar>
+              <w:top w:type="dxa" w:w="80"/>
+              <w:left w:type="dxa" w:w="80"/>
+              <w:bottom w:type="dxa" w:w="80"/>
+              <w:right w:type="dxa" w:w="80"/>
+            </w:tcMar>
+          </w:tcPr>
+          <w:p>
+            <w:pPr>
+              <w:spacing w:after="40"/>
+              <w:jc w:val="left"/>
+            </w:pPr>
+            <w:r>
+              <w:rPr>
+                <w:b w:val="false"/>
+                <w:bCs w:val="false"/>
+                <w:i w:val="false"/>
+                <w:iCs w:val="false"/>
+                <w:color w:val="000000"/>
+                <w:sz w:val="20"/>
+                <w:szCs w:val="20"/>
+                <w:rFonts w:ascii="Times New Roman" w:cs="Times New Roman" w:eastAsia="Times New Roman" w:hAnsi="Times New Roman"/>
+              </w:rPr>
+              <w:t xml:space="preserve">Document imprimé</w:t>
+            </w:r>
+          </w:p>
+        </w:tc>
+        <w:tc>
+          <w:tcPr>
+            <w:tcMar>
+              <w:top w:type="dxa" w:w="80"/>
+              <w:left w:type="dxa" w:w="80"/>
+              <w:bottom w:type="dxa" w:w="80"/>
+              <w:right w:type="dxa" w:w="80"/>
+            </w:tcMar>
+          </w:tcPr>
+          <w:p>
+            <w:pPr>
+              <w:spacing w:after="40"/>
+              <w:jc w:val="left"/>
+            </w:pPr>
+            <w:r>
+              <w:rPr>
+                <w:b w:val="false"/>
+                <w:bCs w:val="false"/>
+                <w:i w:val="false"/>
+                <w:iCs w:val="false"/>
+                <w:color w:val="000000"/>
+                <w:sz w:val="20"/>
+                <w:szCs w:val="20"/>
+                <w:rFonts w:ascii="Times New Roman" w:cs="Times New Roman" w:eastAsia="Times New Roman" w:hAnsi="Times New Roman"/>
+              </w:rPr>
+              <w:t xml:space="preserve">Esprit critique</w:t>
             </w:r>
           </w:p>
         </w:tc>
@@ -5989,7 +6881,26 @@
     </w:p>
     <w:p>
       <w:pPr>
-        <w:spacing w:after="110" w:line="300"/>
+        <w:spacing w:after="160" w:line="300"/>
+        <w:jc w:val="center"/>
+      </w:pPr>
+      <w:r>
+        <w:rPr>
+          <w:b w:val="false"/>
+          <w:bCs w:val="false"/>
+          <w:i/>
+          <w:iCs/>
+          <w:color w:val="000000"/>
+          <w:sz w:val="21"/>
+          <w:szCs w:val="21"/>
+          <w:rFonts w:ascii="Times New Roman" w:cs="Times New Roman" w:eastAsia="Times New Roman" w:hAnsi="Times New Roman"/>
+        </w:rPr>
+        <w:t xml:space="preserve">Deux heures d’enregistrement dans un téléphone ne sont pas encore une source : il faut retranscrire, analyser, vérifier.</w:t>
+      </w:r>
+    </w:p>
+    <w:p>
+      <w:pPr>
+        <w:spacing w:after="80" w:line="300"/>
         <w:jc w:val="both"/>
       </w:pPr>
       <w:r>
@@ -5999,11 +6910,30 @@
           <w:i w:val="false"/>
           <w:iCs w:val="false"/>
           <w:color w:val="2E7D32"/>
-          <w:sz w:val="24"/>
-          <w:szCs w:val="24"/>
-          <w:rFonts w:ascii="Times New Roman" w:cs="Times New Roman" w:eastAsia="Times New Roman" w:hAnsi="Times New Roman"/>
-        </w:rPr>
-        <w:t xml:space="preserve">Définition — </w:t>
+          <w:sz w:val="26"/>
+          <w:szCs w:val="26"/>
+          <w:rFonts w:ascii="Times New Roman" w:cs="Times New Roman" w:eastAsia="Times New Roman" w:hAnsi="Times New Roman"/>
+        </w:rPr>
+        <w:t xml:space="preserve">1. De la problématique à la retranscription</w:t>
+      </w:r>
+    </w:p>
+    <w:p>
+      <w:pPr>
+        <w:spacing w:after="100" w:line="300"/>
+        <w:jc w:val="both"/>
+      </w:pPr>
+      <w:r>
+        <w:rPr>
+          <w:b w:val="false"/>
+          <w:bCs w:val="false"/>
+          <w:i w:val="false"/>
+          <w:iCs w:val="false"/>
+          <w:color w:val="000000"/>
+          <w:sz w:val="24"/>
+          <w:szCs w:val="24"/>
+          <w:rFonts w:ascii="Times New Roman" w:cs="Times New Roman" w:eastAsia="Times New Roman" w:hAnsi="Times New Roman"/>
+        </w:rPr>
+        <w:t xml:space="preserve">La </w:t>
       </w:r>
       <w:r>
         <w:rPr>
@@ -6011,19 +6941,26 @@
           <w:bCs/>
           <w:i w:val="false"/>
           <w:iCs w:val="false"/>
+          <w:color w:val="1F4E79"/>
+          <w:sz w:val="24"/>
+          <w:szCs w:val="24"/>
+          <w:rFonts w:ascii="Times New Roman" w:cs="Times New Roman" w:eastAsia="Times New Roman" w:hAnsi="Times New Roman"/>
+        </w:rPr>
+        <w:t xml:space="preserve">problématique</w:t>
+      </w:r>
+      <w:r>
+        <w:rPr>
+          <w:b w:val="false"/>
+          <w:bCs w:val="false"/>
+          <w:i w:val="false"/>
+          <w:iCs w:val="false"/>
           <w:color w:val="000000"/>
           <w:sz w:val="24"/>
           <w:szCs w:val="24"/>
           <w:rFonts w:ascii="Times New Roman" w:cs="Times New Roman" w:eastAsia="Times New Roman" w:hAnsi="Times New Roman"/>
         </w:rPr>
-        <w:t xml:space="preserve">Produire une source orale, c’est transformer des témoignages recueillis en document historique utilisable. La démarche comprend : poser la problématique (question de recherche), élaborer la grille d’entretien, choisir les témoins et les supports, mener l’entretien, retranscrire les témoignages, les analyser par rapport à la question de recherche, les recouper avec des sources écrites et d’autres sources orales, puis constituer un dossier et le présenter oralement.</w:t>
-      </w:r>
-    </w:p>
-    <w:p>
-      <w:pPr>
-        <w:spacing w:after="110" w:line="300"/>
-        <w:jc w:val="both"/>
-      </w:pPr>
+        <w:t xml:space="preserve"> est la boussole du projet : « Comment l’école de notre commune a-t-elle changé entre 1970 et 1990 ? ». La </w:t>
+      </w:r>
       <w:r>
         <w:rPr>
           <w:b/>
@@ -6035,7 +6972,7 @@
           <w:szCs w:val="24"/>
           <w:rFonts w:ascii="Times New Roman" w:cs="Times New Roman" w:eastAsia="Times New Roman" w:hAnsi="Times New Roman"/>
         </w:rPr>
-        <w:t xml:space="preserve">Autrement dit : </w:t>
+        <w:t xml:space="preserve">grille d’entretien</w:t>
       </w:r>
       <w:r>
         <w:rPr>
@@ -6048,12 +6985,12 @@
           <w:szCs w:val="24"/>
           <w:rFonts w:ascii="Times New Roman" w:cs="Times New Roman" w:eastAsia="Times New Roman" w:hAnsi="Times New Roman"/>
         </w:rPr>
-        <w:t xml:space="preserve">on écrit mot à mot ce que le témoin a dit, on vérifie si cela répond à notre question, on compare avec d’autres sources — et on range le tout dans un dossier qu’on présente à la classe.</w:t>
-      </w:r>
-    </w:p>
-    <w:p>
-      <w:pPr>
-        <w:spacing w:after="110" w:line="300"/>
+        <w:t xml:space="preserve"> liste les questions qui en découlent ; on choisit ensuite les témoins et les supports, puis on mène l’entretien.</w:t>
+      </w:r>
+    </w:p>
+    <w:p>
+      <w:pPr>
+        <w:spacing w:after="100" w:line="300"/>
         <w:jc w:val="both"/>
       </w:pPr>
       <w:r>
@@ -6067,7 +7004,440 @@
           <w:szCs w:val="24"/>
           <w:rFonts w:ascii="Times New Roman" w:cs="Times New Roman" w:eastAsia="Times New Roman" w:hAnsi="Times New Roman"/>
         </w:rPr>
-        <w:t xml:space="preserve">La problématique est la boussole du projet : « Comment l’école de notre commune a-t-elle changé entre 1970 et 1990 ? ». La grille d’entretien liste les questions qui en découlent. Après l’entretien vient la retranscription : écrire fidèlement les paroles du témoin, sans rien ajouter ni corriger — même les hésitations peuvent avoir un sens. Puis l’analyse : que répond le témoignage à la problématique ? Qu’apprend-on de neuf ? Qu’est-ce qui reste obscur ? Vient alors l’étape qui fait de l’élève un vrai historien : le recoupement. La mémoire peut se tromper — dates mélangées, souvenirs embellis. On confronte donc le témoignage à des sources écrites (registres, journaux, photographies datées) et à d’autres témoignages : ce qui concorde est solide ; ce qui diverge appelle la prudence. Enfin, le dossier rassemble tout : problématique, grille, retranscriptions, analyse, conclusion, et la présentation orale restitue le travail devant la classe. Ce dossier devient à son tour une source : dans vingt ans, un chercheur pourra s’en servir. La boucle de l’Histoire orale est bouclée — l’esprit d’analyse et l’esprit critique en sont les deux piliers.</w:t>
+        <w:t xml:space="preserve">Après l’entretien vient la </w:t>
+      </w:r>
+      <w:r>
+        <w:rPr>
+          <w:b/>
+          <w:bCs/>
+          <w:i w:val="false"/>
+          <w:iCs w:val="false"/>
+          <w:color w:val="1F4E79"/>
+          <w:sz w:val="24"/>
+          <w:szCs w:val="24"/>
+          <w:rFonts w:ascii="Times New Roman" w:cs="Times New Roman" w:eastAsia="Times New Roman" w:hAnsi="Times New Roman"/>
+        </w:rPr>
+        <w:t xml:space="preserve">retranscription</w:t>
+      </w:r>
+      <w:r>
+        <w:rPr>
+          <w:b w:val="false"/>
+          <w:bCs w:val="false"/>
+          <w:i w:val="false"/>
+          <w:iCs w:val="false"/>
+          <w:color w:val="000000"/>
+          <w:sz w:val="24"/>
+          <w:szCs w:val="24"/>
+          <w:rFonts w:ascii="Times New Roman" w:cs="Times New Roman" w:eastAsia="Times New Roman" w:hAnsi="Times New Roman"/>
+        </w:rPr>
+        <w:t xml:space="preserve"> : écrire fidèlement les paroles du témoin, sans rien ajouter ni corriger — même les hésitations peuvent avoir un sens.</w:t>
+      </w:r>
+    </w:p>
+    <w:p>
+      <w:pPr>
+        <w:spacing w:after="80" w:line="300"/>
+        <w:jc w:val="both"/>
+      </w:pPr>
+      <w:r>
+        <w:rPr>
+          <w:b/>
+          <w:bCs/>
+          <w:i w:val="false"/>
+          <w:iCs w:val="false"/>
+          <w:color w:val="2E7D32"/>
+          <w:sz w:val="26"/>
+          <w:szCs w:val="26"/>
+          <w:rFonts w:ascii="Times New Roman" w:cs="Times New Roman" w:eastAsia="Times New Roman" w:hAnsi="Times New Roman"/>
+        </w:rPr>
+        <w:t xml:space="preserve">2. Analyser et recouper : le travail de l’historien</w:t>
+      </w:r>
+    </w:p>
+    <w:p>
+      <w:pPr>
+        <w:spacing w:after="100" w:line="300"/>
+        <w:jc w:val="both"/>
+      </w:pPr>
+      <w:r>
+        <w:rPr>
+          <w:b w:val="false"/>
+          <w:bCs w:val="false"/>
+          <w:i w:val="false"/>
+          <w:iCs w:val="false"/>
+          <w:color w:val="000000"/>
+          <w:sz w:val="24"/>
+          <w:szCs w:val="24"/>
+          <w:rFonts w:ascii="Times New Roman" w:cs="Times New Roman" w:eastAsia="Times New Roman" w:hAnsi="Times New Roman"/>
+        </w:rPr>
+        <w:t xml:space="preserve">Puis l’</w:t>
+      </w:r>
+      <w:r>
+        <w:rPr>
+          <w:b/>
+          <w:bCs/>
+          <w:i w:val="false"/>
+          <w:iCs w:val="false"/>
+          <w:color w:val="1F4E79"/>
+          <w:sz w:val="24"/>
+          <w:szCs w:val="24"/>
+          <w:rFonts w:ascii="Times New Roman" w:cs="Times New Roman" w:eastAsia="Times New Roman" w:hAnsi="Times New Roman"/>
+        </w:rPr>
+        <w:t xml:space="preserve">analyse</w:t>
+      </w:r>
+      <w:r>
+        <w:rPr>
+          <w:b w:val="false"/>
+          <w:bCs w:val="false"/>
+          <w:i w:val="false"/>
+          <w:iCs w:val="false"/>
+          <w:color w:val="000000"/>
+          <w:sz w:val="24"/>
+          <w:szCs w:val="24"/>
+          <w:rFonts w:ascii="Times New Roman" w:cs="Times New Roman" w:eastAsia="Times New Roman" w:hAnsi="Times New Roman"/>
+        </w:rPr>
+        <w:t xml:space="preserve"> : que répond le témoignage à la </w:t>
+      </w:r>
+      <w:r>
+        <w:rPr>
+          <w:b/>
+          <w:bCs/>
+          <w:i w:val="false"/>
+          <w:iCs w:val="false"/>
+          <w:color w:val="1F4E79"/>
+          <w:sz w:val="24"/>
+          <w:szCs w:val="24"/>
+          <w:rFonts w:ascii="Times New Roman" w:cs="Times New Roman" w:eastAsia="Times New Roman" w:hAnsi="Times New Roman"/>
+        </w:rPr>
+        <w:t xml:space="preserve">problématique</w:t>
+      </w:r>
+      <w:r>
+        <w:rPr>
+          <w:b w:val="false"/>
+          <w:bCs w:val="false"/>
+          <w:i w:val="false"/>
+          <w:iCs w:val="false"/>
+          <w:color w:val="000000"/>
+          <w:sz w:val="24"/>
+          <w:szCs w:val="24"/>
+          <w:rFonts w:ascii="Times New Roman" w:cs="Times New Roman" w:eastAsia="Times New Roman" w:hAnsi="Times New Roman"/>
+        </w:rPr>
+        <w:t xml:space="preserve"> ? Qu’apprend-on de neuf ? Qu’est-ce qui reste obscur ?</w:t>
+      </w:r>
+    </w:p>
+    <w:p>
+      <w:pPr>
+        <w:spacing w:after="100" w:line="300"/>
+        <w:jc w:val="both"/>
+      </w:pPr>
+      <w:r>
+        <w:rPr>
+          <w:b w:val="false"/>
+          <w:bCs w:val="false"/>
+          <w:i w:val="false"/>
+          <w:iCs w:val="false"/>
+          <w:color w:val="000000"/>
+          <w:sz w:val="24"/>
+          <w:szCs w:val="24"/>
+          <w:rFonts w:ascii="Times New Roman" w:cs="Times New Roman" w:eastAsia="Times New Roman" w:hAnsi="Times New Roman"/>
+        </w:rPr>
+        <w:t xml:space="preserve">Vient alors l’étape qui fait de l’élève un vrai historien : le </w:t>
+      </w:r>
+      <w:r>
+        <w:rPr>
+          <w:b/>
+          <w:bCs/>
+          <w:i w:val="false"/>
+          <w:iCs w:val="false"/>
+          <w:color w:val="1F4E79"/>
+          <w:sz w:val="24"/>
+          <w:szCs w:val="24"/>
+          <w:rFonts w:ascii="Times New Roman" w:cs="Times New Roman" w:eastAsia="Times New Roman" w:hAnsi="Times New Roman"/>
+        </w:rPr>
+        <w:t xml:space="preserve">recoupement</w:t>
+      </w:r>
+      <w:r>
+        <w:rPr>
+          <w:b w:val="false"/>
+          <w:bCs w:val="false"/>
+          <w:i w:val="false"/>
+          <w:iCs w:val="false"/>
+          <w:color w:val="000000"/>
+          <w:sz w:val="24"/>
+          <w:szCs w:val="24"/>
+          <w:rFonts w:ascii="Times New Roman" w:cs="Times New Roman" w:eastAsia="Times New Roman" w:hAnsi="Times New Roman"/>
+        </w:rPr>
+        <w:t xml:space="preserve">. La mémoire peut se tromper — dates mélangées, souvenirs embellis. On confronte donc le témoignage à des </w:t>
+      </w:r>
+      <w:r>
+        <w:rPr>
+          <w:b/>
+          <w:bCs/>
+          <w:i w:val="false"/>
+          <w:iCs w:val="false"/>
+          <w:color w:val="1F4E79"/>
+          <w:sz w:val="24"/>
+          <w:szCs w:val="24"/>
+          <w:rFonts w:ascii="Times New Roman" w:cs="Times New Roman" w:eastAsia="Times New Roman" w:hAnsi="Times New Roman"/>
+        </w:rPr>
+        <w:t xml:space="preserve">sources écrites</w:t>
+      </w:r>
+      <w:r>
+        <w:rPr>
+          <w:b w:val="false"/>
+          <w:bCs w:val="false"/>
+          <w:i w:val="false"/>
+          <w:iCs w:val="false"/>
+          <w:color w:val="000000"/>
+          <w:sz w:val="24"/>
+          <w:szCs w:val="24"/>
+          <w:rFonts w:ascii="Times New Roman" w:cs="Times New Roman" w:eastAsia="Times New Roman" w:hAnsi="Times New Roman"/>
+        </w:rPr>
+        <w:t xml:space="preserve"> (registres, journaux, photographies datées) et à d’autres témoignages : ce qui concorde est solide ; ce qui diverge appelle la prudence.</w:t>
+      </w:r>
+    </w:p>
+    <w:p>
+      <w:pPr>
+        <w:spacing w:after="80" w:line="300"/>
+        <w:jc w:val="both"/>
+      </w:pPr>
+      <w:r>
+        <w:rPr>
+          <w:b/>
+          <w:bCs/>
+          <w:i w:val="false"/>
+          <w:iCs w:val="false"/>
+          <w:color w:val="2E7D32"/>
+          <w:sz w:val="26"/>
+          <w:szCs w:val="26"/>
+          <w:rFonts w:ascii="Times New Roman" w:cs="Times New Roman" w:eastAsia="Times New Roman" w:hAnsi="Times New Roman"/>
+        </w:rPr>
+        <w:t xml:space="preserve">3. Le dossier et la présentation</w:t>
+      </w:r>
+    </w:p>
+    <w:p>
+      <w:pPr>
+        <w:spacing w:after="100" w:line="300"/>
+        <w:jc w:val="both"/>
+      </w:pPr>
+      <w:r>
+        <w:rPr>
+          <w:b w:val="false"/>
+          <w:bCs w:val="false"/>
+          <w:i w:val="false"/>
+          <w:iCs w:val="false"/>
+          <w:color w:val="000000"/>
+          <w:sz w:val="24"/>
+          <w:szCs w:val="24"/>
+          <w:rFonts w:ascii="Times New Roman" w:cs="Times New Roman" w:eastAsia="Times New Roman" w:hAnsi="Times New Roman"/>
+        </w:rPr>
+        <w:t xml:space="preserve">Enfin, le </w:t>
+      </w:r>
+      <w:r>
+        <w:rPr>
+          <w:b/>
+          <w:bCs/>
+          <w:i w:val="false"/>
+          <w:iCs w:val="false"/>
+          <w:color w:val="1F4E79"/>
+          <w:sz w:val="24"/>
+          <w:szCs w:val="24"/>
+          <w:rFonts w:ascii="Times New Roman" w:cs="Times New Roman" w:eastAsia="Times New Roman" w:hAnsi="Times New Roman"/>
+        </w:rPr>
+        <w:t xml:space="preserve">dossier</w:t>
+      </w:r>
+      <w:r>
+        <w:rPr>
+          <w:b w:val="false"/>
+          <w:bCs w:val="false"/>
+          <w:i w:val="false"/>
+          <w:iCs w:val="false"/>
+          <w:color w:val="000000"/>
+          <w:sz w:val="24"/>
+          <w:szCs w:val="24"/>
+          <w:rFonts w:ascii="Times New Roman" w:cs="Times New Roman" w:eastAsia="Times New Roman" w:hAnsi="Times New Roman"/>
+        </w:rPr>
+        <w:t xml:space="preserve"> rassemble tout : </w:t>
+      </w:r>
+      <w:r>
+        <w:rPr>
+          <w:b/>
+          <w:bCs/>
+          <w:i w:val="false"/>
+          <w:iCs w:val="false"/>
+          <w:color w:val="1F4E79"/>
+          <w:sz w:val="24"/>
+          <w:szCs w:val="24"/>
+          <w:rFonts w:ascii="Times New Roman" w:cs="Times New Roman" w:eastAsia="Times New Roman" w:hAnsi="Times New Roman"/>
+        </w:rPr>
+        <w:t xml:space="preserve">problématique</w:t>
+      </w:r>
+      <w:r>
+        <w:rPr>
+          <w:b w:val="false"/>
+          <w:bCs w:val="false"/>
+          <w:i w:val="false"/>
+          <w:iCs w:val="false"/>
+          <w:color w:val="000000"/>
+          <w:sz w:val="24"/>
+          <w:szCs w:val="24"/>
+          <w:rFonts w:ascii="Times New Roman" w:cs="Times New Roman" w:eastAsia="Times New Roman" w:hAnsi="Times New Roman"/>
+        </w:rPr>
+        <w:t xml:space="preserve">, grille, </w:t>
+      </w:r>
+      <w:r>
+        <w:rPr>
+          <w:b/>
+          <w:bCs/>
+          <w:i w:val="false"/>
+          <w:iCs w:val="false"/>
+          <w:color w:val="1F4E79"/>
+          <w:sz w:val="24"/>
+          <w:szCs w:val="24"/>
+          <w:rFonts w:ascii="Times New Roman" w:cs="Times New Roman" w:eastAsia="Times New Roman" w:hAnsi="Times New Roman"/>
+        </w:rPr>
+        <w:t xml:space="preserve">retranscription</w:t>
+      </w:r>
+      <w:r>
+        <w:rPr>
+          <w:b w:val="false"/>
+          <w:bCs w:val="false"/>
+          <w:i w:val="false"/>
+          <w:iCs w:val="false"/>
+          <w:color w:val="000000"/>
+          <w:sz w:val="24"/>
+          <w:szCs w:val="24"/>
+          <w:rFonts w:ascii="Times New Roman" w:cs="Times New Roman" w:eastAsia="Times New Roman" w:hAnsi="Times New Roman"/>
+        </w:rPr>
+        <w:t xml:space="preserve">s, </w:t>
+      </w:r>
+      <w:r>
+        <w:rPr>
+          <w:b/>
+          <w:bCs/>
+          <w:i w:val="false"/>
+          <w:iCs w:val="false"/>
+          <w:color w:val="1F4E79"/>
+          <w:sz w:val="24"/>
+          <w:szCs w:val="24"/>
+          <w:rFonts w:ascii="Times New Roman" w:cs="Times New Roman" w:eastAsia="Times New Roman" w:hAnsi="Times New Roman"/>
+        </w:rPr>
+        <w:t xml:space="preserve">analyse</w:t>
+      </w:r>
+      <w:r>
+        <w:rPr>
+          <w:b w:val="false"/>
+          <w:bCs w:val="false"/>
+          <w:i w:val="false"/>
+          <w:iCs w:val="false"/>
+          <w:color w:val="000000"/>
+          <w:sz w:val="24"/>
+          <w:szCs w:val="24"/>
+          <w:rFonts w:ascii="Times New Roman" w:cs="Times New Roman" w:eastAsia="Times New Roman" w:hAnsi="Times New Roman"/>
+        </w:rPr>
+        <w:t xml:space="preserve">, conclusion ; et la </w:t>
+      </w:r>
+      <w:r>
+        <w:rPr>
+          <w:b/>
+          <w:bCs/>
+          <w:i w:val="false"/>
+          <w:iCs w:val="false"/>
+          <w:color w:val="1F4E79"/>
+          <w:sz w:val="24"/>
+          <w:szCs w:val="24"/>
+          <w:rFonts w:ascii="Times New Roman" w:cs="Times New Roman" w:eastAsia="Times New Roman" w:hAnsi="Times New Roman"/>
+        </w:rPr>
+        <w:t xml:space="preserve">présentation</w:t>
+      </w:r>
+      <w:r>
+        <w:rPr>
+          <w:b w:val="false"/>
+          <w:bCs w:val="false"/>
+          <w:i w:val="false"/>
+          <w:iCs w:val="false"/>
+          <w:color w:val="000000"/>
+          <w:sz w:val="24"/>
+          <w:szCs w:val="24"/>
+          <w:rFonts w:ascii="Times New Roman" w:cs="Times New Roman" w:eastAsia="Times New Roman" w:hAnsi="Times New Roman"/>
+        </w:rPr>
+        <w:t xml:space="preserve"> orale restitue le travail devant la classe. Ce </w:t>
+      </w:r>
+      <w:r>
+        <w:rPr>
+          <w:b/>
+          <w:bCs/>
+          <w:i w:val="false"/>
+          <w:iCs w:val="false"/>
+          <w:color w:val="1F4E79"/>
+          <w:sz w:val="24"/>
+          <w:szCs w:val="24"/>
+          <w:rFonts w:ascii="Times New Roman" w:cs="Times New Roman" w:eastAsia="Times New Roman" w:hAnsi="Times New Roman"/>
+        </w:rPr>
+        <w:t xml:space="preserve">dossier</w:t>
+      </w:r>
+      <w:r>
+        <w:rPr>
+          <w:b w:val="false"/>
+          <w:bCs w:val="false"/>
+          <w:i w:val="false"/>
+          <w:iCs w:val="false"/>
+          <w:color w:val="000000"/>
+          <w:sz w:val="24"/>
+          <w:szCs w:val="24"/>
+          <w:rFonts w:ascii="Times New Roman" w:cs="Times New Roman" w:eastAsia="Times New Roman" w:hAnsi="Times New Roman"/>
+        </w:rPr>
+        <w:t xml:space="preserve"> devient à son tour une source : dans vingt ans, un chercheur pourra s’en servir. La boucle de l’Histoire orale est bouclée — l’esprit d’</w:t>
+      </w:r>
+      <w:r>
+        <w:rPr>
+          <w:b/>
+          <w:bCs/>
+          <w:i w:val="false"/>
+          <w:iCs w:val="false"/>
+          <w:color w:val="1F4E79"/>
+          <w:sz w:val="24"/>
+          <w:szCs w:val="24"/>
+          <w:rFonts w:ascii="Times New Roman" w:cs="Times New Roman" w:eastAsia="Times New Roman" w:hAnsi="Times New Roman"/>
+        </w:rPr>
+        <w:t xml:space="preserve">analyse</w:t>
+      </w:r>
+      <w:r>
+        <w:rPr>
+          <w:b w:val="false"/>
+          <w:bCs w:val="false"/>
+          <w:i w:val="false"/>
+          <w:iCs w:val="false"/>
+          <w:color w:val="000000"/>
+          <w:sz w:val="24"/>
+          <w:szCs w:val="24"/>
+          <w:rFonts w:ascii="Times New Roman" w:cs="Times New Roman" w:eastAsia="Times New Roman" w:hAnsi="Times New Roman"/>
+        </w:rPr>
+        <w:t xml:space="preserve"> et l’</w:t>
+      </w:r>
+      <w:r>
+        <w:rPr>
+          <w:b/>
+          <w:bCs/>
+          <w:i w:val="false"/>
+          <w:iCs w:val="false"/>
+          <w:color w:val="1F4E79"/>
+          <w:sz w:val="24"/>
+          <w:szCs w:val="24"/>
+          <w:rFonts w:ascii="Times New Roman" w:cs="Times New Roman" w:eastAsia="Times New Roman" w:hAnsi="Times New Roman"/>
+        </w:rPr>
+        <w:t xml:space="preserve">esprit critique</w:t>
+      </w:r>
+      <w:r>
+        <w:rPr>
+          <w:b w:val="false"/>
+          <w:bCs w:val="false"/>
+          <w:i w:val="false"/>
+          <w:iCs w:val="false"/>
+          <w:color w:val="000000"/>
+          <w:sz w:val="24"/>
+          <w:szCs w:val="24"/>
+          <w:rFonts w:ascii="Times New Roman" w:cs="Times New Roman" w:eastAsia="Times New Roman" w:hAnsi="Times New Roman"/>
+        </w:rPr>
+        <w:t xml:space="preserve"> en sont les deux piliers.</w:t>
       </w:r>
     </w:p>
     <w:p>
@@ -6118,8 +7488,331 @@
     </w:p>
     <w:p>
       <w:pPr>
-        <w:spacing w:before="200" w:after="150"/>
-        <w:jc w:val="left"/>
+        <w:spacing w:after="120"/>
+      </w:pPr>
+    </w:p>
+    <w:tbl>
+      <w:tblPr>
+        <w:tblW w:type="dxa" w:w="9600"/>
+        <w:tblBorders>
+          <w:top w:val="single" w:color="B25000" w:sz="12"/>
+          <w:left w:val="single" w:color="B25000" w:sz="12"/>
+          <w:bottom w:val="single" w:color="B25000" w:sz="12"/>
+          <w:right w:val="single" w:color="B25000" w:sz="12"/>
+          <w:insideH w:val="none"/>
+          <w:insideV w:val="none"/>
+        </w:tblBorders>
+        <w:tblLayout w:type="fixed"/>
+      </w:tblPr>
+      <w:tblGrid>
+        <w:gridCol w:w="9600"/>
+      </w:tblGrid>
+      <w:tr>
+        <w:tc>
+          <w:tcPr>
+            <w:shd w:fill="FFF8EF" w:val="clear"/>
+            <w:tcMar>
+              <w:top w:type="dxa" w:w="140"/>
+              <w:left w:type="dxa" w:w="180"/>
+              <w:bottom w:type="dxa" w:w="140"/>
+              <w:right w:type="dxa" w:w="180"/>
+            </w:tcMar>
+          </w:tcPr>
+          <w:p>
+            <w:pPr>
+              <w:spacing w:after="90"/>
+            </w:pPr>
+            <w:r>
+              <w:rPr>
+                <w:b/>
+                <w:bCs/>
+                <w:i w:val="false"/>
+                <w:iCs w:val="false"/>
+                <w:color w:val="B25000"/>
+                <w:sz w:val="25"/>
+                <w:szCs w:val="25"/>
+                <w:rFonts w:ascii="Times New Roman" w:cs="Times New Roman" w:eastAsia="Times New Roman" w:hAnsi="Times New Roman"/>
+              </w:rPr>
+              <w:t xml:space="preserve">Document à étudier</w:t>
+            </w:r>
+          </w:p>
+          <w:p>
+            <w:pPr>
+              <w:spacing w:after="80" w:line="300"/>
+              <w:jc w:val="left"/>
+            </w:pPr>
+            <w:r>
+              <w:rPr>
+                <w:b/>
+                <w:bCs/>
+                <w:i w:val="false"/>
+                <w:iCs w:val="false"/>
+                <w:color w:val="000000"/>
+                <w:sz w:val="21"/>
+                <w:szCs w:val="21"/>
+                <w:rFonts w:ascii="Times New Roman" w:cs="Times New Roman" w:eastAsia="Times New Roman" w:hAnsi="Times New Roman"/>
+              </w:rPr>
+              <w:t xml:space="preserve">Comment fut fabriqué le Tantara ny Andriana — d’après la démarche exposée par le R.P. François Callet, Tantara ny Andriana (1878) — extrait adapté</w:t>
+            </w:r>
+          </w:p>
+          <w:p>
+            <w:pPr>
+              <w:spacing w:after="100" w:line="300"/>
+              <w:jc w:val="both"/>
+            </w:pPr>
+            <w:r>
+              <w:rPr>
+                <w:b w:val="false"/>
+                <w:bCs w:val="false"/>
+                <w:i/>
+                <w:iCs/>
+                <w:color w:val="000000"/>
+                <w:sz w:val="24"/>
+                <w:szCs w:val="24"/>
+                <w:rFonts w:ascii="Times New Roman" w:cs="Times New Roman" w:eastAsia="Times New Roman" w:hAnsi="Times New Roman"/>
+              </w:rPr>
+              <w:t xml:space="preserve">« J’ai recueilli ces récits de la bouche même des anciens qui gardent la tradition. Je les ai écrits dans leur langue, tels qu’ils furent prononcés, sans y mêler mes propres paroles : car ce sont les ancêtres qui parlent ici, non moi. Lorsque les versions différaient, je les ai notées toutes, l’une après l’autre, afin que le lecteur puisse les comparer. Et j’ai rassemblé le tout en un livre, pour que la mémoire des royaumes ne meure pas avec ceux qui la portent. »</w:t>
+            </w:r>
+          </w:p>
+          <w:p>
+            <w:pPr>
+              <w:spacing w:after="40" w:line="300"/>
+              <w:jc w:val="both"/>
+            </w:pPr>
+            <w:r>
+              <w:rPr>
+                <w:b w:val="false"/>
+                <w:bCs w:val="false"/>
+                <w:i w:val="false"/>
+                <w:iCs w:val="false"/>
+                <w:color w:val="000000"/>
+                <w:sz w:val="24"/>
+                <w:szCs w:val="24"/>
+                <w:rFonts w:ascii="Times New Roman" w:cs="Times New Roman" w:eastAsia="Times New Roman" w:hAnsi="Times New Roman"/>
+              </w:rPr>
+              <w:t xml:space="preserve">1. Quelle règle de la retranscription Callet applique-t-il ? Cite la phrase qui le montre.</w:t>
+            </w:r>
+          </w:p>
+          <w:p>
+            <w:pPr>
+              <w:spacing w:after="40" w:line="300"/>
+              <w:jc w:val="both"/>
+            </w:pPr>
+            <w:r>
+              <w:rPr>
+                <w:b w:val="false"/>
+                <w:bCs w:val="false"/>
+                <w:i w:val="false"/>
+                <w:iCs w:val="false"/>
+                <w:color w:val="000000"/>
+                <w:sz w:val="24"/>
+                <w:szCs w:val="24"/>
+                <w:rFonts w:ascii="Times New Roman" w:cs="Times New Roman" w:eastAsia="Times New Roman" w:hAnsi="Times New Roman"/>
+              </w:rPr>
+              <w:t xml:space="preserve">2. Que fait Callet quand deux versions d’un récit diffèrent, et à quelle étape de la leçon cela correspond-il ?</w:t>
+            </w:r>
+          </w:p>
+          <w:p>
+            <w:pPr>
+              <w:spacing w:after="40" w:line="300"/>
+              <w:jc w:val="both"/>
+            </w:pPr>
+            <w:r>
+              <w:rPr>
+                <w:b w:val="false"/>
+                <w:bCs w:val="false"/>
+                <w:i w:val="false"/>
+                <w:iCs w:val="false"/>
+                <w:color w:val="000000"/>
+                <w:sz w:val="24"/>
+                <w:szCs w:val="24"/>
+                <w:rFonts w:ascii="Times New Roman" w:cs="Times New Roman" w:eastAsia="Times New Roman" w:hAnsi="Times New Roman"/>
+              </w:rPr>
+              <w:t xml:space="preserve">3. En quoi le livre de Callet illustre-t-il la phrase « le dossier devient à son tour une source » ?</w:t>
+            </w:r>
+          </w:p>
+          <w:p>
+            <w:pPr>
+              <w:spacing w:after="60"/>
+            </w:pPr>
+          </w:p>
+          <w:p>
+            <w:pPr>
+              <w:spacing w:after="40"/>
+            </w:pPr>
+            <w:r>
+              <w:rPr>
+                <w:b/>
+                <w:bCs/>
+                <w:i w:val="false"/>
+                <w:iCs w:val="false"/>
+                <w:color w:val="C2185B"/>
+                <w:sz w:val="22"/>
+                <w:szCs w:val="22"/>
+                <w:rFonts w:ascii="Times New Roman" w:cs="Times New Roman" w:eastAsia="Times New Roman" w:hAnsi="Times New Roman"/>
+              </w:rPr>
+              <w:t xml:space="preserve">Réponse 1. </w:t>
+            </w:r>
+            <w:r>
+              <w:rPr>
+                <w:b w:val="false"/>
+                <w:bCs w:val="false"/>
+                <w:i w:val="false"/>
+                <w:iCs w:val="false"/>
+                <w:color w:val="000000"/>
+                <w:sz w:val="22"/>
+                <w:szCs w:val="22"/>
+                <w:rFonts w:ascii="Times New Roman" w:cs="Times New Roman" w:eastAsia="Times New Roman" w:hAnsi="Times New Roman"/>
+              </w:rPr>
+              <w:t xml:space="preserve">La fidélité absolue : « je les ai écrits dans leur langue, tels qu’ils furent prononcés, sans y mêler mes propres paroles ».</w:t>
+            </w:r>
+          </w:p>
+          <w:p>
+            <w:pPr>
+              <w:spacing w:after="40"/>
+            </w:pPr>
+            <w:r>
+              <w:rPr>
+                <w:b/>
+                <w:bCs/>
+                <w:i w:val="false"/>
+                <w:iCs w:val="false"/>
+                <w:color w:val="C2185B"/>
+                <w:sz w:val="22"/>
+                <w:szCs w:val="22"/>
+                <w:rFonts w:ascii="Times New Roman" w:cs="Times New Roman" w:eastAsia="Times New Roman" w:hAnsi="Times New Roman"/>
+              </w:rPr>
+              <w:t xml:space="preserve">Réponse 2. </w:t>
+            </w:r>
+            <w:r>
+              <w:rPr>
+                <w:b w:val="false"/>
+                <w:bCs w:val="false"/>
+                <w:i w:val="false"/>
+                <w:iCs w:val="false"/>
+                <w:color w:val="000000"/>
+                <w:sz w:val="22"/>
+                <w:szCs w:val="22"/>
+                <w:rFonts w:ascii="Times New Roman" w:cs="Times New Roman" w:eastAsia="Times New Roman" w:hAnsi="Times New Roman"/>
+              </w:rPr>
+              <w:t xml:space="preserve">Il note toutes les versions pour qu’on puisse les comparer : c’est le recoupement des témoignages, l’étape critique de la démarche.</w:t>
+            </w:r>
+          </w:p>
+          <w:p>
+            <w:pPr>
+              <w:spacing w:after="40"/>
+            </w:pPr>
+            <w:r>
+              <w:rPr>
+                <w:b/>
+                <w:bCs/>
+                <w:i w:val="false"/>
+                <w:iCs w:val="false"/>
+                <w:color w:val="C2185B"/>
+                <w:sz w:val="22"/>
+                <w:szCs w:val="22"/>
+                <w:rFonts w:ascii="Times New Roman" w:cs="Times New Roman" w:eastAsia="Times New Roman" w:hAnsi="Times New Roman"/>
+              </w:rPr>
+              <w:t xml:space="preserve">Réponse 3. </w:t>
+            </w:r>
+            <w:r>
+              <w:rPr>
+                <w:b w:val="false"/>
+                <w:bCs w:val="false"/>
+                <w:i w:val="false"/>
+                <w:iCs w:val="false"/>
+                <w:color w:val="000000"/>
+                <w:sz w:val="22"/>
+                <w:szCs w:val="22"/>
+                <w:rFonts w:ascii="Times New Roman" w:cs="Times New Roman" w:eastAsia="Times New Roman" w:hAnsi="Times New Roman"/>
+              </w:rPr>
+              <w:t xml:space="preserve">Son dossier d’entretiens, devenu livre, est aujourd’hui l’une des sources majeures de l’histoire de l’Imerina : les chercheurs s’en servent plus d’un siècle après.</w:t>
+            </w:r>
+          </w:p>
+        </w:tc>
+      </w:tr>
+    </w:tbl>
+    <w:p>
+      <w:pPr>
+        <w:spacing w:after="160"/>
+      </w:pPr>
+    </w:p>
+    <w:tbl>
+      <w:tblPr>
+        <w:tblW w:type="dxa" w:w="9600"/>
+        <w:tblBorders>
+          <w:top w:val="single" w:color="1565C0" w:sz="12"/>
+          <w:left w:val="single" w:color="1565C0" w:sz="12"/>
+          <w:bottom w:val="single" w:color="1565C0" w:sz="12"/>
+          <w:right w:val="single" w:color="1565C0" w:sz="12"/>
+          <w:insideH w:val="none"/>
+          <w:insideV w:val="none"/>
+        </w:tblBorders>
+        <w:tblLayout w:type="fixed"/>
+      </w:tblPr>
+      <w:tblGrid>
+        <w:gridCol w:w="9600"/>
+      </w:tblGrid>
+      <w:tr>
+        <w:tc>
+          <w:tcPr>
+            <w:shd w:fill="E3F2FD" w:val="clear"/>
+            <w:tcMar>
+              <w:top w:type="dxa" w:w="140"/>
+              <w:left w:type="dxa" w:w="180"/>
+              <w:bottom w:type="dxa" w:w="140"/>
+              <w:right w:type="dxa" w:w="180"/>
+            </w:tcMar>
+          </w:tcPr>
+          <w:p>
+            <w:pPr>
+              <w:spacing w:after="90"/>
+            </w:pPr>
+            <w:r>
+              <w:rPr>
+                <w:b/>
+                <w:bCs/>
+                <w:i w:val="false"/>
+                <w:iCs w:val="false"/>
+                <w:color w:val="1565C0"/>
+                <w:sz w:val="25"/>
+                <w:szCs w:val="25"/>
+                <w:rFonts w:ascii="Times New Roman" w:cs="Times New Roman" w:eastAsia="Times New Roman" w:hAnsi="Times New Roman"/>
+              </w:rPr>
+              <w:t xml:space="preserve">Le savais-tu ?</w:t>
+            </w:r>
+          </w:p>
+          <w:p>
+            <w:pPr>
+              <w:spacing w:after="0" w:line="300"/>
+              <w:jc w:val="both"/>
+            </w:pPr>
+            <w:r>
+              <w:rPr>
+                <w:b w:val="false"/>
+                <w:bCs w:val="false"/>
+                <w:i w:val="false"/>
+                <w:iCs w:val="false"/>
+                <w:color w:val="000000"/>
+                <w:sz w:val="22"/>
+                <w:szCs w:val="22"/>
+                <w:rFonts w:ascii="Times New Roman" w:cs="Times New Roman" w:eastAsia="Times New Roman" w:hAnsi="Times New Roman"/>
+              </w:rPr>
+              <w:t xml:space="preserve">Le « Tantara ny Andriana », somme monumentale de l’histoire de l’Imerina, est né exactement de cette démarche : au XIXᵉ siècle, le père Callet a interrogé des anciens, retranscrit leurs récits en malgache, recoupé les versions entre elles — et son dossier est devenu l’une des sources majeures de l’histoire de Madagascar. Une source orale bien produite peut traverser les siècles !</w:t>
+            </w:r>
+          </w:p>
+        </w:tc>
+      </w:tr>
+    </w:tbl>
+    <w:p>
+      <w:pPr>
+        <w:spacing w:after="160"/>
+      </w:pPr>
+    </w:p>
+    <w:p>
+      <w:pPr>
+        <w:spacing w:after="80" w:line="300"/>
+        <w:jc w:val="both"/>
       </w:pPr>
       <w:r>
         <w:rPr>
@@ -6128,166 +7821,337 @@
           <w:i w:val="false"/>
           <w:iCs w:val="false"/>
           <w:color w:val="2E7D32"/>
-          <w:sz w:val="28"/>
-          <w:szCs w:val="28"/>
-          <w:rFonts w:ascii="Times New Roman" w:cs="Times New Roman" w:eastAsia="Times New Roman" w:hAnsi="Times New Roman"/>
-        </w:rPr>
-        <w:t xml:space="preserve">Méthode</w:t>
-      </w:r>
-    </w:p>
-    <w:p>
-      <w:pPr>
-        <w:spacing w:after="60" w:line="300"/>
-        <w:jc w:val="both"/>
-      </w:pPr>
-      <w:r>
-        <w:rPr>
-          <w:b w:val="false"/>
-          <w:bCs w:val="false"/>
-          <w:i w:val="false"/>
-          <w:iCs w:val="false"/>
-          <w:color w:val="000000"/>
-          <w:sz w:val="24"/>
-          <w:szCs w:val="24"/>
-          <w:rFonts w:ascii="Times New Roman" w:cs="Times New Roman" w:eastAsia="Times New Roman" w:hAnsi="Times New Roman"/>
-        </w:rPr>
-        <w:t xml:space="preserve">1. Retranscrire fidèlement les paroles, sans corriger ni ajouter.</w:t>
-      </w:r>
-    </w:p>
-    <w:p>
-      <w:pPr>
-        <w:spacing w:after="60" w:line="300"/>
-        <w:jc w:val="both"/>
-      </w:pPr>
-      <w:r>
-        <w:rPr>
-          <w:b w:val="false"/>
-          <w:bCs w:val="false"/>
-          <w:i w:val="false"/>
-          <w:iCs w:val="false"/>
-          <w:color w:val="000000"/>
-          <w:sz w:val="24"/>
-          <w:szCs w:val="24"/>
-          <w:rFonts w:ascii="Times New Roman" w:cs="Times New Roman" w:eastAsia="Times New Roman" w:hAnsi="Times New Roman"/>
-        </w:rPr>
-        <w:t xml:space="preserve">2. Analyser : confronter le témoignage à la problématique de départ.</w:t>
-      </w:r>
-    </w:p>
-    <w:p>
-      <w:pPr>
-        <w:spacing w:after="60" w:line="300"/>
-        <w:jc w:val="both"/>
-      </w:pPr>
-      <w:r>
-        <w:rPr>
-          <w:b w:val="false"/>
-          <w:bCs w:val="false"/>
-          <w:i w:val="false"/>
-          <w:iCs w:val="false"/>
-          <w:color w:val="000000"/>
-          <w:sz w:val="24"/>
-          <w:szCs w:val="24"/>
-          <w:rFonts w:ascii="Times New Roman" w:cs="Times New Roman" w:eastAsia="Times New Roman" w:hAnsi="Times New Roman"/>
-        </w:rPr>
-        <w:t xml:space="preserve">3. Recouper avec des sources écrites et d’autres témoignages avant de conclure ; constituer le dossier.</w:t>
-      </w:r>
-    </w:p>
-    <w:p>
-      <w:pPr>
-        <w:spacing w:after="110" w:line="300"/>
-        <w:jc w:val="both"/>
-      </w:pPr>
-      <w:r>
-        <w:rPr>
-          <w:b/>
-          <w:bCs/>
-          <w:i w:val="false"/>
-          <w:iCs w:val="false"/>
-          <w:color w:val="1F4E79"/>
-          <w:sz w:val="24"/>
-          <w:szCs w:val="24"/>
-          <w:rFonts w:ascii="Times New Roman" w:cs="Times New Roman" w:eastAsia="Times New Roman" w:hAnsi="Times New Roman"/>
-        </w:rPr>
-        <w:t xml:space="preserve">Exemple — </w:t>
-      </w:r>
-      <w:r>
-        <w:rPr>
-          <w:b w:val="false"/>
-          <w:bCs w:val="false"/>
-          <w:i w:val="false"/>
-          <w:iCs w:val="false"/>
-          <w:color w:val="000000"/>
-          <w:sz w:val="24"/>
-          <w:szCs w:val="24"/>
-          <w:rFonts w:ascii="Times New Roman" w:cs="Times New Roman" w:eastAsia="Times New Roman" w:hAnsi="Times New Roman"/>
-        </w:rPr>
-        <w:t xml:space="preserve">Dadabe affirme que l’école a brûlé « vers 1975 ». Le registre communal indique l’incendie en 1977. La classe retient 1977 en signalant l’écart : le recoupement a corrigé la mémoire sans disqualifier le témoin.</w:t>
-      </w:r>
-    </w:p>
-    <w:p>
-      <w:pPr>
-        <w:spacing w:after="110" w:line="300"/>
-        <w:jc w:val="both"/>
-      </w:pPr>
-      <w:r>
-        <w:rPr>
-          <w:b/>
-          <w:bCs/>
-          <w:i w:val="false"/>
-          <w:iCs w:val="false"/>
-          <w:color w:val="B25000"/>
-          <w:sz w:val="24"/>
-          <w:szCs w:val="24"/>
-          <w:rFonts w:ascii="Times New Roman" w:cs="Times New Roman" w:eastAsia="Times New Roman" w:hAnsi="Times New Roman"/>
-        </w:rPr>
-        <w:t xml:space="preserve">Erreur à éviter — </w:t>
-      </w:r>
-      <w:r>
-        <w:rPr>
-          <w:b w:val="false"/>
-          <w:bCs w:val="false"/>
-          <w:i w:val="false"/>
-          <w:iCs w:val="false"/>
-          <w:color w:val="000000"/>
-          <w:sz w:val="24"/>
-          <w:szCs w:val="24"/>
-          <w:rFonts w:ascii="Times New Roman" w:cs="Times New Roman" w:eastAsia="Times New Roman" w:hAnsi="Times New Roman"/>
-        </w:rPr>
-        <w:t xml:space="preserve">Prendre le témoignage pour argent comptant et le recopier comme une vérité : une source orale non recoupée n’est qu’un souvenir. Sans confrontation avec d’autres sources, le dossier n’a pas de valeur historique.</w:t>
-      </w:r>
-    </w:p>
-    <w:p>
-      <w:pPr>
-        <w:shd w:fill="E3F2FD" w:val="clear"/>
-        <w:spacing w:after="110" w:line="300"/>
-        <w:jc w:val="both"/>
-      </w:pPr>
-      <w:r>
-        <w:rPr>
-          <w:b/>
-          <w:bCs/>
-          <w:i w:val="false"/>
-          <w:iCs w:val="false"/>
-          <w:color w:val="1565C0"/>
-          <w:sz w:val="24"/>
-          <w:szCs w:val="24"/>
-          <w:rFonts w:ascii="Times New Roman" w:cs="Times New Roman" w:eastAsia="Times New Roman" w:hAnsi="Times New Roman"/>
-        </w:rPr>
-        <w:t xml:space="preserve">Le savais-tu ? </w:t>
-      </w:r>
-      <w:r>
-        <w:rPr>
-          <w:b w:val="false"/>
-          <w:bCs w:val="false"/>
-          <w:i w:val="false"/>
-          <w:iCs w:val="false"/>
-          <w:color w:val="000000"/>
-          <w:sz w:val="24"/>
-          <w:szCs w:val="24"/>
-          <w:rFonts w:ascii="Times New Roman" w:cs="Times New Roman" w:eastAsia="Times New Roman" w:hAnsi="Times New Roman"/>
-        </w:rPr>
-        <w:t xml:space="preserve">Le « Tantara ny Andriana », somme monumentale de l’histoire de l’Imerina, est né exactement de cette démarche : au XIXᵉ siècle, le père Callet a interrogé des anciens, retranscrit leurs récits en malgache, recoupé les versions entre elles — et son dossier est devenu l’une des sources majeures de l’histoire de Madagascar. Une source orale bien produite peut traverser les siècles !</w:t>
-      </w:r>
+          <w:sz w:val="26"/>
+          <w:szCs w:val="26"/>
+          <w:rFonts w:ascii="Times New Roman" w:cs="Times New Roman" w:eastAsia="Times New Roman" w:hAnsi="Times New Roman"/>
+        </w:rPr>
+        <w:t xml:space="preserve">Petit lexique</w:t>
+      </w:r>
+    </w:p>
+    <w:tbl>
+      <w:tblPr>
+        <w:tblW w:type="dxa" w:w="9600"/>
+        <w:tblBorders>
+          <w:top w:val="single" w:color="808080" w:sz="4"/>
+          <w:left w:val="single" w:color="808080" w:sz="4"/>
+          <w:bottom w:val="single" w:color="808080" w:sz="4"/>
+          <w:right w:val="single" w:color="808080" w:sz="4"/>
+          <w:insideH w:val="single" w:color="B0B0B0" w:sz="4"/>
+          <w:insideV w:val="single" w:color="B0B0B0" w:sz="4"/>
+        </w:tblBorders>
+        <w:tblLayout w:type="fixed"/>
+      </w:tblPr>
+      <w:tblGrid>
+        <w:gridCol w:w="2800"/>
+        <w:gridCol w:w="6800"/>
+      </w:tblGrid>
+      <w:tr>
+        <w:tc>
+          <w:tcPr>
+            <w:shd w:fill="E7E6E6" w:val="clear"/>
+            <w:tcMar>
+              <w:top w:type="dxa" w:w="80"/>
+              <w:left w:type="dxa" w:w="80"/>
+              <w:bottom w:type="dxa" w:w="80"/>
+              <w:right w:type="dxa" w:w="80"/>
+            </w:tcMar>
+          </w:tcPr>
+          <w:p>
+            <w:pPr>
+              <w:spacing w:after="40"/>
+              <w:jc w:val="left"/>
+            </w:pPr>
+            <w:r>
+              <w:rPr>
+                <w:b/>
+                <w:bCs/>
+                <w:i w:val="false"/>
+                <w:iCs w:val="false"/>
+                <w:color w:val="000000"/>
+                <w:sz w:val="20"/>
+                <w:szCs w:val="20"/>
+                <w:rFonts w:ascii="Times New Roman" w:cs="Times New Roman" w:eastAsia="Times New Roman" w:hAnsi="Times New Roman"/>
+              </w:rPr>
+              <w:t xml:space="preserve">Mot</w:t>
+            </w:r>
+          </w:p>
+        </w:tc>
+        <w:tc>
+          <w:tcPr>
+            <w:shd w:fill="E7E6E6" w:val="clear"/>
+            <w:tcMar>
+              <w:top w:type="dxa" w:w="80"/>
+              <w:left w:type="dxa" w:w="80"/>
+              <w:bottom w:type="dxa" w:w="80"/>
+              <w:right w:type="dxa" w:w="80"/>
+            </w:tcMar>
+          </w:tcPr>
+          <w:p>
+            <w:pPr>
+              <w:spacing w:after="40"/>
+              <w:jc w:val="left"/>
+            </w:pPr>
+            <w:r>
+              <w:rPr>
+                <w:b/>
+                <w:bCs/>
+                <w:i w:val="false"/>
+                <w:iCs w:val="false"/>
+                <w:color w:val="000000"/>
+                <w:sz w:val="20"/>
+                <w:szCs w:val="20"/>
+                <w:rFonts w:ascii="Times New Roman" w:cs="Times New Roman" w:eastAsia="Times New Roman" w:hAnsi="Times New Roman"/>
+              </w:rPr>
+              <w:t xml:space="preserve">Sens</w:t>
+            </w:r>
+          </w:p>
+        </w:tc>
+      </w:tr>
+      <w:tr>
+        <w:tc>
+          <w:tcPr>
+            <w:tcMar>
+              <w:top w:type="dxa" w:w="80"/>
+              <w:left w:type="dxa" w:w="80"/>
+              <w:bottom w:type="dxa" w:w="80"/>
+              <w:right w:type="dxa" w:w="80"/>
+            </w:tcMar>
+          </w:tcPr>
+          <w:p>
+            <w:pPr>
+              <w:spacing w:after="40"/>
+              <w:jc w:val="left"/>
+            </w:pPr>
+            <w:r>
+              <w:rPr>
+                <w:b/>
+                <w:bCs/>
+                <w:i w:val="false"/>
+                <w:iCs w:val="false"/>
+                <w:color w:val="000000"/>
+                <w:sz w:val="20"/>
+                <w:szCs w:val="20"/>
+                <w:rFonts w:ascii="Times New Roman" w:cs="Times New Roman" w:eastAsia="Times New Roman" w:hAnsi="Times New Roman"/>
+              </w:rPr>
+              <w:t xml:space="preserve">Problématique</w:t>
+            </w:r>
+          </w:p>
+        </w:tc>
+        <w:tc>
+          <w:tcPr>
+            <w:tcMar>
+              <w:top w:type="dxa" w:w="80"/>
+              <w:left w:type="dxa" w:w="80"/>
+              <w:bottom w:type="dxa" w:w="80"/>
+              <w:right w:type="dxa" w:w="80"/>
+            </w:tcMar>
+          </w:tcPr>
+          <w:p>
+            <w:pPr>
+              <w:spacing w:after="40"/>
+              <w:jc w:val="left"/>
+            </w:pPr>
+            <w:r>
+              <w:rPr>
+                <w:b w:val="false"/>
+                <w:bCs w:val="false"/>
+                <w:i w:val="false"/>
+                <w:iCs w:val="false"/>
+                <w:color w:val="000000"/>
+                <w:sz w:val="20"/>
+                <w:szCs w:val="20"/>
+                <w:rFonts w:ascii="Times New Roman" w:cs="Times New Roman" w:eastAsia="Times New Roman" w:hAnsi="Times New Roman"/>
+              </w:rPr>
+              <w:t xml:space="preserve">question de recherche qui guide toute l’enquête</w:t>
+            </w:r>
+          </w:p>
+        </w:tc>
+      </w:tr>
+      <w:tr>
+        <w:tc>
+          <w:tcPr>
+            <w:tcMar>
+              <w:top w:type="dxa" w:w="80"/>
+              <w:left w:type="dxa" w:w="80"/>
+              <w:bottom w:type="dxa" w:w="80"/>
+              <w:right w:type="dxa" w:w="80"/>
+            </w:tcMar>
+          </w:tcPr>
+          <w:p>
+            <w:pPr>
+              <w:spacing w:after="40"/>
+              <w:jc w:val="left"/>
+            </w:pPr>
+            <w:r>
+              <w:rPr>
+                <w:b/>
+                <w:bCs/>
+                <w:i w:val="false"/>
+                <w:iCs w:val="false"/>
+                <w:color w:val="000000"/>
+                <w:sz w:val="20"/>
+                <w:szCs w:val="20"/>
+                <w:rFonts w:ascii="Times New Roman" w:cs="Times New Roman" w:eastAsia="Times New Roman" w:hAnsi="Times New Roman"/>
+              </w:rPr>
+              <w:t xml:space="preserve">Retranscription</w:t>
+            </w:r>
+          </w:p>
+        </w:tc>
+        <w:tc>
+          <w:tcPr>
+            <w:tcMar>
+              <w:top w:type="dxa" w:w="80"/>
+              <w:left w:type="dxa" w:w="80"/>
+              <w:bottom w:type="dxa" w:w="80"/>
+              <w:right w:type="dxa" w:w="80"/>
+            </w:tcMar>
+          </w:tcPr>
+          <w:p>
+            <w:pPr>
+              <w:spacing w:after="40"/>
+              <w:jc w:val="left"/>
+            </w:pPr>
+            <w:r>
+              <w:rPr>
+                <w:b w:val="false"/>
+                <w:bCs w:val="false"/>
+                <w:i w:val="false"/>
+                <w:iCs w:val="false"/>
+                <w:color w:val="000000"/>
+                <w:sz w:val="20"/>
+                <w:szCs w:val="20"/>
+                <w:rFonts w:ascii="Times New Roman" w:cs="Times New Roman" w:eastAsia="Times New Roman" w:hAnsi="Times New Roman"/>
+              </w:rPr>
+              <w:t xml:space="preserve">écriture fidèle, mot à mot, des paroles du témoin</w:t>
+            </w:r>
+          </w:p>
+        </w:tc>
+      </w:tr>
+      <w:tr>
+        <w:tc>
+          <w:tcPr>
+            <w:tcMar>
+              <w:top w:type="dxa" w:w="80"/>
+              <w:left w:type="dxa" w:w="80"/>
+              <w:bottom w:type="dxa" w:w="80"/>
+              <w:right w:type="dxa" w:w="80"/>
+            </w:tcMar>
+          </w:tcPr>
+          <w:p>
+            <w:pPr>
+              <w:spacing w:after="40"/>
+              <w:jc w:val="left"/>
+            </w:pPr>
+            <w:r>
+              <w:rPr>
+                <w:b/>
+                <w:bCs/>
+                <w:i w:val="false"/>
+                <w:iCs w:val="false"/>
+                <w:color w:val="000000"/>
+                <w:sz w:val="20"/>
+                <w:szCs w:val="20"/>
+                <w:rFonts w:ascii="Times New Roman" w:cs="Times New Roman" w:eastAsia="Times New Roman" w:hAnsi="Times New Roman"/>
+              </w:rPr>
+              <w:t xml:space="preserve">Recoupement</w:t>
+            </w:r>
+          </w:p>
+        </w:tc>
+        <w:tc>
+          <w:tcPr>
+            <w:tcMar>
+              <w:top w:type="dxa" w:w="80"/>
+              <w:left w:type="dxa" w:w="80"/>
+              <w:bottom w:type="dxa" w:w="80"/>
+              <w:right w:type="dxa" w:w="80"/>
+            </w:tcMar>
+          </w:tcPr>
+          <w:p>
+            <w:pPr>
+              <w:spacing w:after="40"/>
+              <w:jc w:val="left"/>
+            </w:pPr>
+            <w:r>
+              <w:rPr>
+                <w:b w:val="false"/>
+                <w:bCs w:val="false"/>
+                <w:i w:val="false"/>
+                <w:iCs w:val="false"/>
+                <w:color w:val="000000"/>
+                <w:sz w:val="20"/>
+                <w:szCs w:val="20"/>
+                <w:rFonts w:ascii="Times New Roman" w:cs="Times New Roman" w:eastAsia="Times New Roman" w:hAnsi="Times New Roman"/>
+              </w:rPr>
+              <w:t xml:space="preserve">confrontation d’un témoignage à d’autres sources</w:t>
+            </w:r>
+          </w:p>
+        </w:tc>
+      </w:tr>
+      <w:tr>
+        <w:tc>
+          <w:tcPr>
+            <w:tcMar>
+              <w:top w:type="dxa" w:w="80"/>
+              <w:left w:type="dxa" w:w="80"/>
+              <w:bottom w:type="dxa" w:w="80"/>
+              <w:right w:type="dxa" w:w="80"/>
+            </w:tcMar>
+          </w:tcPr>
+          <w:p>
+            <w:pPr>
+              <w:spacing w:after="40"/>
+              <w:jc w:val="left"/>
+            </w:pPr>
+            <w:r>
+              <w:rPr>
+                <w:b/>
+                <w:bCs/>
+                <w:i w:val="false"/>
+                <w:iCs w:val="false"/>
+                <w:color w:val="000000"/>
+                <w:sz w:val="20"/>
+                <w:szCs w:val="20"/>
+                <w:rFonts w:ascii="Times New Roman" w:cs="Times New Roman" w:eastAsia="Times New Roman" w:hAnsi="Times New Roman"/>
+              </w:rPr>
+              <w:t xml:space="preserve">Dossier</w:t>
+            </w:r>
+          </w:p>
+        </w:tc>
+        <w:tc>
+          <w:tcPr>
+            <w:tcMar>
+              <w:top w:type="dxa" w:w="80"/>
+              <w:left w:type="dxa" w:w="80"/>
+              <w:bottom w:type="dxa" w:w="80"/>
+              <w:right w:type="dxa" w:w="80"/>
+            </w:tcMar>
+          </w:tcPr>
+          <w:p>
+            <w:pPr>
+              <w:spacing w:after="40"/>
+              <w:jc w:val="left"/>
+            </w:pPr>
+            <w:r>
+              <w:rPr>
+                <w:b w:val="false"/>
+                <w:bCs w:val="false"/>
+                <w:i w:val="false"/>
+                <w:iCs w:val="false"/>
+                <w:color w:val="000000"/>
+                <w:sz w:val="20"/>
+                <w:szCs w:val="20"/>
+                <w:rFonts w:ascii="Times New Roman" w:cs="Times New Roman" w:eastAsia="Times New Roman" w:hAnsi="Times New Roman"/>
+              </w:rPr>
+              <w:t xml:space="preserve">ensemble ordonné des pièces de l’enquête, présenté à la classe</w:t>
+            </w:r>
+          </w:p>
+        </w:tc>
+      </w:tr>
+    </w:tbl>
+    <w:p>
+      <w:pPr>
+        <w:spacing w:after="120"/>
+      </w:pPr>
     </w:p>
     <w:p>
       <w:pPr>

</xml_diff>